<commit_message>
agrego file excel del informe y actualizo el informe
</commit_message>
<xml_diff>
--- a/proyecto_final/Proyecto_Final_TorresEmiliana.docx
+++ b/proyecto_final/Proyecto_Final_TorresEmiliana.docx
@@ -3980,14 +3980,34 @@
                                     <w:text/>
                                   </w:sdtPr>
                                   <w:sdtContent>
+                                    <w:proofErr w:type="spellStart"/>
                                     <w:r>
                                       <w:rPr>
                                         <w:color w:val="404040" w:themeColor="text1" w:themeTint="BF"/>
                                         <w:sz w:val="36"/>
                                         <w:szCs w:val="36"/>
                                       </w:rPr>
-                                      <w:t>Curso SQL - Coderhouse</w:t>
+                                      <w:t>Curso</w:t>
                                     </w:r>
+                                    <w:proofErr w:type="spellEnd"/>
+                                    <w:r>
+                                      <w:rPr>
+                                        <w:color w:val="404040" w:themeColor="text1" w:themeTint="BF"/>
+                                        <w:sz w:val="36"/>
+                                        <w:szCs w:val="36"/>
+                                      </w:rPr>
+                                      <w:t xml:space="preserve"> SQL - </w:t>
+                                    </w:r>
+                                    <w:proofErr w:type="spellStart"/>
+                                    <w:r>
+                                      <w:rPr>
+                                        <w:color w:val="404040" w:themeColor="text1" w:themeTint="BF"/>
+                                        <w:sz w:val="36"/>
+                                        <w:szCs w:val="36"/>
+                                      </w:rPr>
+                                      <w:t>Coderhouse</w:t>
+                                    </w:r>
+                                    <w:proofErr w:type="spellEnd"/>
                                   </w:sdtContent>
                                 </w:sdt>
                               </w:p>
@@ -4077,14 +4097,34 @@
                               <w:text/>
                             </w:sdtPr>
                             <w:sdtContent>
+                              <w:proofErr w:type="spellStart"/>
                               <w:r>
                                 <w:rPr>
                                   <w:color w:val="404040" w:themeColor="text1" w:themeTint="BF"/>
                                   <w:sz w:val="36"/>
                                   <w:szCs w:val="36"/>
                                 </w:rPr>
-                                <w:t>Curso SQL - Coderhouse</w:t>
+                                <w:t>Curso</w:t>
                               </w:r>
+                              <w:proofErr w:type="spellEnd"/>
+                              <w:r>
+                                <w:rPr>
+                                  <w:color w:val="404040" w:themeColor="text1" w:themeTint="BF"/>
+                                  <w:sz w:val="36"/>
+                                  <w:szCs w:val="36"/>
+                                </w:rPr>
+                                <w:t xml:space="preserve"> SQL - </w:t>
+                              </w:r>
+                              <w:proofErr w:type="spellStart"/>
+                              <w:r>
+                                <w:rPr>
+                                  <w:color w:val="404040" w:themeColor="text1" w:themeTint="BF"/>
+                                  <w:sz w:val="36"/>
+                                  <w:szCs w:val="36"/>
+                                </w:rPr>
+                                <w:t>Coderhouse</w:t>
+                              </w:r>
+                              <w:proofErr w:type="spellEnd"/>
                             </w:sdtContent>
                           </w:sdt>
                         </w:p>
@@ -4230,7 +4270,27 @@
           <w:lang w:val="es-AR"/>
         </w:rPr>
         <w:br/>
-        <w:t>En ella se gestionan clases de Crossfit, entrenamiento Funcional y Weightlifting. Además, se incluye un análisis descriptivo con una tabla que muestra el contenido detallado de la base de datos, junto con un diagrama esquemático que representa las relaciones entre sus entidades.</w:t>
+        <w:t xml:space="preserve">En ella se gestionan clases de Crossfit, entrenamiento Funcional y </w:t>
+      </w:r>
+      <w:proofErr w:type="spellStart"/>
+      <w:r>
+        <w:rPr>
+          <w:rFonts w:ascii="Arial" w:eastAsia="Arial" w:hAnsi="Arial" w:cs="Arial"/>
+          <w:sz w:val="24"/>
+          <w:szCs w:val="24"/>
+          <w:lang w:val="es-AR"/>
+        </w:rPr>
+        <w:t>Weightlifting</w:t>
+      </w:r>
+      <w:proofErr w:type="spellEnd"/>
+      <w:r>
+        <w:rPr>
+          <w:rFonts w:ascii="Arial" w:eastAsia="Arial" w:hAnsi="Arial" w:cs="Arial"/>
+          <w:sz w:val="24"/>
+          <w:szCs w:val="24"/>
+          <w:lang w:val="es-AR"/>
+        </w:rPr>
+        <w:t>. Además, se incluye un análisis descriptivo con una tabla que muestra el contenido detallado de la base de datos, junto con un diagrama esquemático que representa las relaciones entre sus entidades.</w:t>
       </w:r>
     </w:p>
     <w:p>
@@ -4306,7 +4366,27 @@
           <w:szCs w:val="24"/>
           <w:lang w:val="es-AR"/>
         </w:rPr>
-        <w:t>En un gimnasio o box especializado en CrossFit, Funcional y Weightlifting, la gestión de forma manual de las inscripciones, reservas de clases, asignación de entrenadores y el control de pagos genera demoras, errores y falta de seguimiento. Por lo tanto, esta situación dificulta tanto el trabajo del personal como la experiencia del cliente.</w:t>
+        <w:t xml:space="preserve">En un gimnasio o box especializado en CrossFit, Funcional y </w:t>
+      </w:r>
+      <w:proofErr w:type="spellStart"/>
+      <w:r>
+        <w:rPr>
+          <w:rFonts w:ascii="Arial" w:eastAsia="Arial" w:hAnsi="Arial" w:cs="Arial"/>
+          <w:sz w:val="24"/>
+          <w:szCs w:val="24"/>
+          <w:lang w:val="es-AR"/>
+        </w:rPr>
+        <w:t>Weightlifting</w:t>
+      </w:r>
+      <w:proofErr w:type="spellEnd"/>
+      <w:r>
+        <w:rPr>
+          <w:rFonts w:ascii="Arial" w:eastAsia="Arial" w:hAnsi="Arial" w:cs="Arial"/>
+          <w:sz w:val="24"/>
+          <w:szCs w:val="24"/>
+          <w:lang w:val="es-AR"/>
+        </w:rPr>
+        <w:t>, la gestión de forma manual de las inscripciones, reservas de clases, asignación de entrenadores y el control de pagos genera demoras, errores y falta de seguimiento. Por lo tanto, esta situación dificulta tanto el trabajo del personal como la experiencia del cliente.</w:t>
       </w:r>
     </w:p>
     <w:p>
@@ -4743,6 +4823,7 @@
           <w:u w:val="single"/>
         </w:rPr>
       </w:pPr>
+      <w:proofErr w:type="spellStart"/>
       <w:r>
         <w:rPr>
           <w:rFonts w:ascii="Arial" w:eastAsia="Arial" w:hAnsi="Arial" w:cs="Arial"/>
@@ -4753,7 +4834,67 @@
           <w:u w:val="single"/>
         </w:rPr>
         <w:lastRenderedPageBreak/>
-        <w:t>Diagrama Entidad Relación (DER)</w:t>
+        <w:t>Diagrama</w:t>
+      </w:r>
+      <w:proofErr w:type="spellEnd"/>
+      <w:r>
+        <w:rPr>
+          <w:rFonts w:ascii="Arial" w:eastAsia="Arial" w:hAnsi="Arial" w:cs="Arial"/>
+          <w:b/>
+          <w:bCs/>
+          <w:sz w:val="24"/>
+          <w:szCs w:val="24"/>
+          <w:u w:val="single"/>
+        </w:rPr>
+        <w:t xml:space="preserve"> </w:t>
+      </w:r>
+      <w:proofErr w:type="spellStart"/>
+      <w:r>
+        <w:rPr>
+          <w:rFonts w:ascii="Arial" w:eastAsia="Arial" w:hAnsi="Arial" w:cs="Arial"/>
+          <w:b/>
+          <w:bCs/>
+          <w:sz w:val="24"/>
+          <w:szCs w:val="24"/>
+          <w:u w:val="single"/>
+        </w:rPr>
+        <w:t>Entidad</w:t>
+      </w:r>
+      <w:proofErr w:type="spellEnd"/>
+      <w:r>
+        <w:rPr>
+          <w:rFonts w:ascii="Arial" w:eastAsia="Arial" w:hAnsi="Arial" w:cs="Arial"/>
+          <w:b/>
+          <w:bCs/>
+          <w:sz w:val="24"/>
+          <w:szCs w:val="24"/>
+          <w:u w:val="single"/>
+        </w:rPr>
+        <w:t xml:space="preserve"> </w:t>
+      </w:r>
+      <w:proofErr w:type="spellStart"/>
+      <w:r>
+        <w:rPr>
+          <w:rFonts w:ascii="Arial" w:eastAsia="Arial" w:hAnsi="Arial" w:cs="Arial"/>
+          <w:b/>
+          <w:bCs/>
+          <w:sz w:val="24"/>
+          <w:szCs w:val="24"/>
+          <w:u w:val="single"/>
+        </w:rPr>
+        <w:t>Relación</w:t>
+      </w:r>
+      <w:proofErr w:type="spellEnd"/>
+      <w:r>
+        <w:rPr>
+          <w:rFonts w:ascii="Arial" w:eastAsia="Arial" w:hAnsi="Arial" w:cs="Arial"/>
+          <w:b/>
+          <w:bCs/>
+          <w:sz w:val="24"/>
+          <w:szCs w:val="24"/>
+          <w:u w:val="single"/>
+        </w:rPr>
+        <w:t xml:space="preserve"> (DER)</w:t>
       </w:r>
     </w:p>
     <w:p>
@@ -4831,6 +4972,7 @@
           <w:u w:val="single"/>
         </w:rPr>
       </w:pPr>
+      <w:proofErr w:type="spellStart"/>
       <w:r>
         <w:rPr>
           <w:rFonts w:ascii="Arial" w:eastAsia="Arial" w:hAnsi="Arial" w:cs="Arial"/>
@@ -4840,8 +4982,33 @@
           <w:szCs w:val="24"/>
           <w:u w:val="single"/>
         </w:rPr>
-        <w:t>Diagrama de Tablas</w:t>
-      </w:r>
+        <w:t>Diagrama</w:t>
+      </w:r>
+      <w:proofErr w:type="spellEnd"/>
+      <w:r>
+        <w:rPr>
+          <w:rFonts w:ascii="Arial" w:eastAsia="Arial" w:hAnsi="Arial" w:cs="Arial"/>
+          <w:b/>
+          <w:bCs/>
+          <w:sz w:val="24"/>
+          <w:szCs w:val="24"/>
+          <w:u w:val="single"/>
+        </w:rPr>
+        <w:t xml:space="preserve"> de </w:t>
+      </w:r>
+      <w:proofErr w:type="spellStart"/>
+      <w:r>
+        <w:rPr>
+          <w:rFonts w:ascii="Arial" w:eastAsia="Arial" w:hAnsi="Arial" w:cs="Arial"/>
+          <w:b/>
+          <w:bCs/>
+          <w:sz w:val="24"/>
+          <w:szCs w:val="24"/>
+          <w:u w:val="single"/>
+        </w:rPr>
+        <w:t>Tablas</w:t>
+      </w:r>
+      <w:proofErr w:type="spellEnd"/>
     </w:p>
     <w:tbl>
       <w:tblPr>
@@ -4886,6 +5053,7 @@
                 <w:szCs w:val="24"/>
               </w:rPr>
             </w:pPr>
+            <w:proofErr w:type="spellStart"/>
             <w:r>
               <w:rPr>
                 <w:b/>
@@ -4895,6 +5063,7 @@
               </w:rPr>
               <w:t>Tabla</w:t>
             </w:r>
+            <w:proofErr w:type="spellEnd"/>
           </w:p>
         </w:tc>
         <w:tc>
@@ -4967,6 +5136,7 @@
                 <w:szCs w:val="24"/>
               </w:rPr>
             </w:pPr>
+            <w:proofErr w:type="spellStart"/>
             <w:r>
               <w:rPr>
                 <w:b/>
@@ -4974,78 +5144,62 @@
                 <w:sz w:val="24"/>
                 <w:szCs w:val="24"/>
               </w:rPr>
-              <w:t>Detalle Campo</w:t>
-            </w:r>
-          </w:p>
-        </w:tc>
-        <w:tc>
-          <w:tcPr>
-            <w:tcW w:w="705" w:type="dxa"/>
-            <w:shd w:val="clear" w:color="auto" w:fill="ED7D31"/>
-          </w:tcPr>
-          <w:p>
-            <w:pPr>
-              <w:spacing w:before="240"/>
-              <w:jc w:val="center"/>
+              <w:t>Detalle</w:t>
+            </w:r>
+            <w:proofErr w:type="spellEnd"/>
+            <w:r>
               <w:rPr>
                 <w:b/>
                 <w:bCs/>
                 <w:sz w:val="24"/>
                 <w:szCs w:val="24"/>
               </w:rPr>
-            </w:pPr>
-            <w:r>
+              <w:t xml:space="preserve"> Campo</w:t>
+            </w:r>
+          </w:p>
+        </w:tc>
+        <w:tc>
+          <w:tcPr>
+            <w:tcW w:w="705" w:type="dxa"/>
+            <w:shd w:val="clear" w:color="auto" w:fill="ED7D31"/>
+          </w:tcPr>
+          <w:p>
+            <w:pPr>
+              <w:spacing w:before="240"/>
+              <w:jc w:val="center"/>
               <w:rPr>
                 <w:b/>
                 <w:bCs/>
                 <w:sz w:val="24"/>
                 <w:szCs w:val="24"/>
               </w:rPr>
-              <w:t>PK</w:t>
-            </w:r>
-          </w:p>
-        </w:tc>
-        <w:tc>
-          <w:tcPr>
-            <w:tcW w:w="570" w:type="dxa"/>
-            <w:shd w:val="clear" w:color="auto" w:fill="70AD47"/>
-          </w:tcPr>
-          <w:p>
-            <w:pPr>
-              <w:spacing w:before="240"/>
-              <w:jc w:val="center"/>
+            </w:pPr>
+            <w:r>
               <w:rPr>
                 <w:b/>
                 <w:bCs/>
                 <w:sz w:val="24"/>
                 <w:szCs w:val="24"/>
               </w:rPr>
-            </w:pPr>
-            <w:r>
+              <w:t>PK</w:t>
+            </w:r>
+          </w:p>
+        </w:tc>
+        <w:tc>
+          <w:tcPr>
+            <w:tcW w:w="570" w:type="dxa"/>
+            <w:shd w:val="clear" w:color="auto" w:fill="70AD47"/>
+          </w:tcPr>
+          <w:p>
+            <w:pPr>
+              <w:spacing w:before="240"/>
+              <w:jc w:val="center"/>
               <w:rPr>
                 <w:b/>
                 <w:bCs/>
                 <w:sz w:val="24"/>
                 <w:szCs w:val="24"/>
               </w:rPr>
-              <w:t>FK</w:t>
-            </w:r>
-          </w:p>
-        </w:tc>
-      </w:tr>
-      <w:tr>
-        <w:tc>
-          <w:tcPr>
-            <w:tcW w:w="1690" w:type="dxa"/>
-            <w:shd w:val="clear" w:color="auto" w:fill="8496B0"/>
-          </w:tcPr>
-          <w:p>
-            <w:pPr>
-              <w:spacing w:line="360" w:lineRule="auto"/>
-              <w:rPr>
-                <w:b/>
-                <w:bCs/>
-              </w:rPr>
             </w:pPr>
             <w:r>
               <w:rPr>
@@ -5054,8 +5208,36 @@
                 <w:sz w:val="24"/>
                 <w:szCs w:val="24"/>
               </w:rPr>
+              <w:t>FK</w:t>
+            </w:r>
+          </w:p>
+        </w:tc>
+      </w:tr>
+      <w:tr>
+        <w:tc>
+          <w:tcPr>
+            <w:tcW w:w="1690" w:type="dxa"/>
+            <w:shd w:val="clear" w:color="auto" w:fill="8496B0"/>
+          </w:tcPr>
+          <w:p>
+            <w:pPr>
+              <w:spacing w:line="360" w:lineRule="auto"/>
+              <w:rPr>
+                <w:b/>
+                <w:bCs/>
+              </w:rPr>
+            </w:pPr>
+            <w:proofErr w:type="spellStart"/>
+            <w:r>
+              <w:rPr>
+                <w:b/>
+                <w:bCs/>
+                <w:sz w:val="24"/>
+                <w:szCs w:val="24"/>
+              </w:rPr>
               <w:t>clientes</w:t>
             </w:r>
+            <w:proofErr w:type="spellEnd"/>
           </w:p>
         </w:tc>
         <w:tc>
@@ -5066,9 +5248,11 @@
             <w:pPr>
               <w:spacing w:line="360" w:lineRule="auto"/>
             </w:pPr>
+            <w:proofErr w:type="spellStart"/>
             <w:r>
               <w:t>Id_cliente</w:t>
             </w:r>
+            <w:proofErr w:type="spellEnd"/>
           </w:p>
         </w:tc>
         <w:tc>
@@ -5092,9 +5276,19 @@
             <w:pPr>
               <w:spacing w:line="360" w:lineRule="auto"/>
             </w:pPr>
-            <w:r>
-              <w:t>Identificador único</w:t>
-            </w:r>
+            <w:proofErr w:type="spellStart"/>
+            <w:r>
+              <w:t>Identificador</w:t>
+            </w:r>
+            <w:proofErr w:type="spellEnd"/>
+            <w:r>
+              <w:t xml:space="preserve"> </w:t>
+            </w:r>
+            <w:proofErr w:type="spellStart"/>
+            <w:r>
+              <w:t>único</w:t>
+            </w:r>
+            <w:proofErr w:type="spellEnd"/>
           </w:p>
         </w:tc>
         <w:tc>
@@ -5150,9 +5344,11 @@
             <w:pPr>
               <w:spacing w:line="360" w:lineRule="auto"/>
             </w:pPr>
+            <w:proofErr w:type="spellStart"/>
             <w:r>
               <w:t>Nombre</w:t>
             </w:r>
+            <w:proofErr w:type="spellEnd"/>
           </w:p>
         </w:tc>
         <w:tc>
@@ -5176,8 +5372,13 @@
             <w:pPr>
               <w:spacing w:line="360" w:lineRule="auto"/>
             </w:pPr>
-            <w:r>
-              <w:t>Nombre del socio</w:t>
+            <w:proofErr w:type="spellStart"/>
+            <w:r>
+              <w:t>Nombre</w:t>
+            </w:r>
+            <w:proofErr w:type="spellEnd"/>
+            <w:r>
+              <w:t xml:space="preserve"> del socio</w:t>
             </w:r>
           </w:p>
         </w:tc>
@@ -5222,9 +5423,11 @@
             <w:pPr>
               <w:spacing w:line="360" w:lineRule="auto"/>
             </w:pPr>
+            <w:proofErr w:type="spellStart"/>
             <w:r>
               <w:t>Apellido</w:t>
             </w:r>
+            <w:proofErr w:type="spellEnd"/>
           </w:p>
         </w:tc>
         <w:tc>
@@ -5248,8 +5451,13 @@
             <w:pPr>
               <w:spacing w:line="360" w:lineRule="auto"/>
             </w:pPr>
-            <w:r>
-              <w:t>Apellido del socio</w:t>
+            <w:proofErr w:type="spellStart"/>
+            <w:r>
+              <w:t>Apellido</w:t>
+            </w:r>
+            <w:proofErr w:type="spellEnd"/>
+            <w:r>
+              <w:t xml:space="preserve"> del socio</w:t>
             </w:r>
           </w:p>
         </w:tc>
@@ -5294,9 +5502,11 @@
             <w:pPr>
               <w:spacing w:line="360" w:lineRule="auto"/>
             </w:pPr>
+            <w:proofErr w:type="spellStart"/>
             <w:r>
               <w:t>Dni</w:t>
             </w:r>
+            <w:proofErr w:type="spellEnd"/>
           </w:p>
         </w:tc>
         <w:tc>
@@ -5320,9 +5530,19 @@
             <w:pPr>
               <w:spacing w:line="360" w:lineRule="auto"/>
             </w:pPr>
-            <w:r>
-              <w:t>Documento de identidad</w:t>
-            </w:r>
+            <w:proofErr w:type="spellStart"/>
+            <w:r>
+              <w:t>Documento</w:t>
+            </w:r>
+            <w:proofErr w:type="spellEnd"/>
+            <w:r>
+              <w:t xml:space="preserve"> de </w:t>
+            </w:r>
+            <w:proofErr w:type="spellStart"/>
+            <w:r>
+              <w:t>identidad</w:t>
+            </w:r>
+            <w:proofErr w:type="spellEnd"/>
           </w:p>
         </w:tc>
         <w:tc>
@@ -5366,9 +5586,11 @@
             <w:pPr>
               <w:spacing w:line="360" w:lineRule="auto"/>
             </w:pPr>
+            <w:proofErr w:type="spellStart"/>
             <w:r>
               <w:t>Fecha_nacimiento</w:t>
             </w:r>
+            <w:proofErr w:type="spellEnd"/>
           </w:p>
         </w:tc>
         <w:tc>
@@ -5392,8 +5614,13 @@
             <w:pPr>
               <w:spacing w:line="360" w:lineRule="auto"/>
             </w:pPr>
-            <w:r>
-              <w:t>Fecha de Nacimiento</w:t>
+            <w:proofErr w:type="spellStart"/>
+            <w:r>
+              <w:t>Fecha</w:t>
+            </w:r>
+            <w:proofErr w:type="spellEnd"/>
+            <w:r>
+              <w:t xml:space="preserve"> de Nacimiento</w:t>
             </w:r>
           </w:p>
         </w:tc>
@@ -5438,9 +5665,11 @@
             <w:pPr>
               <w:spacing w:line="360" w:lineRule="auto"/>
             </w:pPr>
+            <w:proofErr w:type="spellStart"/>
             <w:r>
               <w:t>Telefono</w:t>
             </w:r>
+            <w:proofErr w:type="spellEnd"/>
           </w:p>
         </w:tc>
         <w:tc>
@@ -5464,9 +5693,19 @@
             <w:pPr>
               <w:spacing w:line="360" w:lineRule="auto"/>
             </w:pPr>
-            <w:r>
-              <w:t>Teléfono de contacto</w:t>
-            </w:r>
+            <w:proofErr w:type="spellStart"/>
+            <w:r>
+              <w:t>Teléfono</w:t>
+            </w:r>
+            <w:proofErr w:type="spellEnd"/>
+            <w:r>
+              <w:t xml:space="preserve"> de </w:t>
+            </w:r>
+            <w:proofErr w:type="spellStart"/>
+            <w:r>
+              <w:t>contacto</w:t>
+            </w:r>
+            <w:proofErr w:type="spellEnd"/>
           </w:p>
         </w:tc>
         <w:tc>
@@ -5510,9 +5749,11 @@
             <w:pPr>
               <w:spacing w:line="360" w:lineRule="auto"/>
             </w:pPr>
+            <w:proofErr w:type="spellStart"/>
             <w:r>
               <w:t>Fecha_registro</w:t>
             </w:r>
+            <w:proofErr w:type="spellEnd"/>
           </w:p>
         </w:tc>
         <w:tc>
@@ -5603,9 +5844,11 @@
             <w:pPr>
               <w:spacing w:line="360" w:lineRule="auto"/>
             </w:pPr>
+            <w:proofErr w:type="spellStart"/>
             <w:r>
               <w:t>estado</w:t>
             </w:r>
+            <w:proofErr w:type="spellEnd"/>
           </w:p>
         </w:tc>
         <w:tc>
@@ -5699,6 +5942,7 @@
                 <w:bCs/>
               </w:rPr>
             </w:pPr>
+            <w:proofErr w:type="spellStart"/>
             <w:r>
               <w:rPr>
                 <w:b/>
@@ -5706,6 +5950,7 @@
               </w:rPr>
               <w:t>Entrenadores</w:t>
             </w:r>
+            <w:proofErr w:type="spellEnd"/>
           </w:p>
         </w:tc>
         <w:tc>
@@ -5717,9 +5962,11 @@
             <w:vAlign w:val="center"/>
           </w:tcPr>
           <w:p>
+            <w:proofErr w:type="spellStart"/>
             <w:r>
               <w:t>Id_entrenador</w:t>
             </w:r>
+            <w:proofErr w:type="spellEnd"/>
           </w:p>
         </w:tc>
         <w:tc>
@@ -5748,9 +5995,19 @@
             <w:pPr>
               <w:spacing w:line="360" w:lineRule="auto"/>
             </w:pPr>
-            <w:r>
-              <w:t>Identificador único</w:t>
-            </w:r>
+            <w:proofErr w:type="spellStart"/>
+            <w:r>
+              <w:t>Identificador</w:t>
+            </w:r>
+            <w:proofErr w:type="spellEnd"/>
+            <w:r>
+              <w:t xml:space="preserve"> </w:t>
+            </w:r>
+            <w:proofErr w:type="spellStart"/>
+            <w:r>
+              <w:t>único</w:t>
+            </w:r>
+            <w:proofErr w:type="spellEnd"/>
           </w:p>
         </w:tc>
         <w:tc>
@@ -5815,9 +6072,11 @@
             <w:vAlign w:val="center"/>
           </w:tcPr>
           <w:p>
+            <w:proofErr w:type="spellStart"/>
             <w:r>
               <w:t>Nombre</w:t>
             </w:r>
+            <w:proofErr w:type="spellEnd"/>
           </w:p>
         </w:tc>
         <w:tc>
@@ -5837,9 +6096,19 @@
             <w:vAlign w:val="center"/>
           </w:tcPr>
           <w:p>
-            <w:r>
-              <w:t>Nombre del entrenador</w:t>
-            </w:r>
+            <w:proofErr w:type="spellStart"/>
+            <w:r>
+              <w:t>Nombre</w:t>
+            </w:r>
+            <w:proofErr w:type="spellEnd"/>
+            <w:r>
+              <w:t xml:space="preserve"> del </w:t>
+            </w:r>
+            <w:proofErr w:type="spellStart"/>
+            <w:r>
+              <w:t>entrenador</w:t>
+            </w:r>
+            <w:proofErr w:type="spellEnd"/>
           </w:p>
         </w:tc>
         <w:tc>
@@ -5882,9 +6151,11 @@
             <w:vAlign w:val="center"/>
           </w:tcPr>
           <w:p>
+            <w:proofErr w:type="spellStart"/>
             <w:r>
               <w:t>Apellido</w:t>
             </w:r>
+            <w:proofErr w:type="spellEnd"/>
           </w:p>
         </w:tc>
         <w:tc>
@@ -5904,9 +6175,19 @@
             <w:vAlign w:val="center"/>
           </w:tcPr>
           <w:p>
-            <w:r>
-              <w:t>Apellido del entrenador</w:t>
-            </w:r>
+            <w:proofErr w:type="spellStart"/>
+            <w:r>
+              <w:t>Apellido</w:t>
+            </w:r>
+            <w:proofErr w:type="spellEnd"/>
+            <w:r>
+              <w:t xml:space="preserve"> del </w:t>
+            </w:r>
+            <w:proofErr w:type="spellStart"/>
+            <w:r>
+              <w:t>entrenador</w:t>
+            </w:r>
+            <w:proofErr w:type="spellEnd"/>
           </w:p>
         </w:tc>
         <w:tc>
@@ -5949,9 +6230,11 @@
             <w:vAlign w:val="center"/>
           </w:tcPr>
           <w:p>
+            <w:proofErr w:type="spellStart"/>
             <w:r>
               <w:t>Especialidad</w:t>
             </w:r>
+            <w:proofErr w:type="spellEnd"/>
           </w:p>
         </w:tc>
         <w:tc>
@@ -5971,9 +6254,19 @@
             <w:vAlign w:val="center"/>
           </w:tcPr>
           <w:p>
-            <w:r>
-              <w:t>Especialidad del entrenador</w:t>
-            </w:r>
+            <w:proofErr w:type="spellStart"/>
+            <w:r>
+              <w:t>Especialidad</w:t>
+            </w:r>
+            <w:proofErr w:type="spellEnd"/>
+            <w:r>
+              <w:t xml:space="preserve"> del </w:t>
+            </w:r>
+            <w:proofErr w:type="spellStart"/>
+            <w:r>
+              <w:t>entrenador</w:t>
+            </w:r>
+            <w:proofErr w:type="spellEnd"/>
           </w:p>
         </w:tc>
         <w:tc>
@@ -6016,9 +6309,11 @@
             <w:vAlign w:val="center"/>
           </w:tcPr>
           <w:p>
+            <w:proofErr w:type="spellStart"/>
             <w:r>
               <w:t>Telefono</w:t>
             </w:r>
+            <w:proofErr w:type="spellEnd"/>
           </w:p>
         </w:tc>
         <w:tc>
@@ -6038,9 +6333,19 @@
             <w:vAlign w:val="center"/>
           </w:tcPr>
           <w:p>
-            <w:r>
-              <w:t>Teléfono del entrenador</w:t>
-            </w:r>
+            <w:proofErr w:type="spellStart"/>
+            <w:r>
+              <w:t>Teléfono</w:t>
+            </w:r>
+            <w:proofErr w:type="spellEnd"/>
+            <w:r>
+              <w:t xml:space="preserve"> del </w:t>
+            </w:r>
+            <w:proofErr w:type="spellStart"/>
+            <w:r>
+              <w:t>entrenador</w:t>
+            </w:r>
+            <w:proofErr w:type="spellEnd"/>
           </w:p>
         </w:tc>
         <w:tc>
@@ -6083,9 +6388,11 @@
             <w:vAlign w:val="center"/>
           </w:tcPr>
           <w:p>
+            <w:proofErr w:type="spellStart"/>
             <w:r>
               <w:t>Fecha_alta</w:t>
             </w:r>
+            <w:proofErr w:type="spellEnd"/>
           </w:p>
         </w:tc>
         <w:tc>
@@ -6117,7 +6424,27 @@
                 <w:szCs w:val="24"/>
                 <w:lang w:val="es-AR"/>
               </w:rPr>
-              <w:t>momento en que comienzó a cotizar</w:t>
+              <w:t xml:space="preserve">momento en que </w:t>
+            </w:r>
+            <w:proofErr w:type="spellStart"/>
+            <w:r>
+              <w:rPr>
+                <w:rFonts w:ascii="Roboto" w:eastAsia="Roboto" w:hAnsi="Roboto" w:cs="Roboto"/>
+                <w:sz w:val="24"/>
+                <w:szCs w:val="24"/>
+                <w:lang w:val="es-AR"/>
+              </w:rPr>
+              <w:t>comienzó</w:t>
+            </w:r>
+            <w:proofErr w:type="spellEnd"/>
+            <w:r>
+              <w:rPr>
+                <w:rFonts w:ascii="Roboto" w:eastAsia="Roboto" w:hAnsi="Roboto" w:cs="Roboto"/>
+                <w:sz w:val="24"/>
+                <w:szCs w:val="24"/>
+                <w:lang w:val="es-AR"/>
+              </w:rPr>
+              <w:t xml:space="preserve"> a cotizar</w:t>
             </w:r>
           </w:p>
         </w:tc>
@@ -6272,6 +6599,7 @@
                 <w:bCs/>
               </w:rPr>
             </w:pPr>
+            <w:proofErr w:type="spellStart"/>
             <w:r>
               <w:rPr>
                 <w:b/>
@@ -6279,6 +6607,7 @@
               </w:rPr>
               <w:t>wods</w:t>
             </w:r>
+            <w:proofErr w:type="spellEnd"/>
           </w:p>
         </w:tc>
         <w:tc>
@@ -6290,9 +6619,11 @@
             <w:vAlign w:val="center"/>
           </w:tcPr>
           <w:p>
+            <w:proofErr w:type="spellStart"/>
             <w:r>
               <w:t>Id_wod</w:t>
             </w:r>
+            <w:proofErr w:type="spellEnd"/>
           </w:p>
         </w:tc>
         <w:tc>
@@ -6321,9 +6652,19 @@
             <w:pPr>
               <w:spacing w:line="360" w:lineRule="auto"/>
             </w:pPr>
-            <w:r>
-              <w:t>Identificador único</w:t>
-            </w:r>
+            <w:proofErr w:type="spellStart"/>
+            <w:r>
+              <w:t>Identificador</w:t>
+            </w:r>
+            <w:proofErr w:type="spellEnd"/>
+            <w:r>
+              <w:t xml:space="preserve"> </w:t>
+            </w:r>
+            <w:proofErr w:type="spellStart"/>
+            <w:r>
+              <w:t>único</w:t>
+            </w:r>
+            <w:proofErr w:type="spellEnd"/>
           </w:p>
         </w:tc>
         <w:tc>
@@ -6412,8 +6753,32 @@
               <w:rPr>
                 <w:lang w:val="es-AR"/>
               </w:rPr>
-              <w:t>Tipo de clase, ej: AMRAP, EMOM, FOR TIME,etc</w:t>
-            </w:r>
+              <w:t xml:space="preserve">Tipo de clase, </w:t>
+            </w:r>
+            <w:proofErr w:type="spellStart"/>
+            <w:r>
+              <w:rPr>
+                <w:lang w:val="es-AR"/>
+              </w:rPr>
+              <w:t>ej</w:t>
+            </w:r>
+            <w:proofErr w:type="spellEnd"/>
+            <w:r>
+              <w:rPr>
+                <w:lang w:val="es-AR"/>
+              </w:rPr>
+              <w:t xml:space="preserve">: AMRAP, EMOM, FOR </w:t>
+            </w:r>
+            <w:proofErr w:type="spellStart"/>
+            <w:proofErr w:type="gramStart"/>
+            <w:r>
+              <w:rPr>
+                <w:lang w:val="es-AR"/>
+              </w:rPr>
+              <w:t>TIME,etc</w:t>
+            </w:r>
+            <w:proofErr w:type="spellEnd"/>
+            <w:proofErr w:type="gramEnd"/>
           </w:p>
         </w:tc>
         <w:tc>
@@ -6469,9 +6834,11 @@
             <w:vAlign w:val="center"/>
           </w:tcPr>
           <w:p>
+            <w:proofErr w:type="spellStart"/>
             <w:r>
               <w:t>Descripcion_clase</w:t>
             </w:r>
+            <w:proofErr w:type="spellEnd"/>
           </w:p>
         </w:tc>
         <w:tc>
@@ -6500,7 +6867,49 @@
               <w:rPr>
                 <w:lang w:val="es-AR"/>
               </w:rPr>
-              <w:t>Descripción detallada de ejercicios a realizar en la clase en el warmup, weightlifting y wod.</w:t>
+              <w:t xml:space="preserve">Descripción detallada de ejercicios a realizar en la clase en el </w:t>
+            </w:r>
+            <w:proofErr w:type="spellStart"/>
+            <w:r>
+              <w:rPr>
+                <w:lang w:val="es-AR"/>
+              </w:rPr>
+              <w:t>warmup</w:t>
+            </w:r>
+            <w:proofErr w:type="spellEnd"/>
+            <w:r>
+              <w:rPr>
+                <w:lang w:val="es-AR"/>
+              </w:rPr>
+              <w:t xml:space="preserve">, </w:t>
+            </w:r>
+            <w:proofErr w:type="spellStart"/>
+            <w:r>
+              <w:rPr>
+                <w:lang w:val="es-AR"/>
+              </w:rPr>
+              <w:t>weightlifting</w:t>
+            </w:r>
+            <w:proofErr w:type="spellEnd"/>
+            <w:r>
+              <w:rPr>
+                <w:lang w:val="es-AR"/>
+              </w:rPr>
+              <w:t xml:space="preserve"> y </w:t>
+            </w:r>
+            <w:proofErr w:type="spellStart"/>
+            <w:r>
+              <w:rPr>
+                <w:lang w:val="es-AR"/>
+              </w:rPr>
+              <w:t>wod</w:t>
+            </w:r>
+            <w:proofErr w:type="spellEnd"/>
+            <w:r>
+              <w:rPr>
+                <w:lang w:val="es-AR"/>
+              </w:rPr>
+              <w:t>.</w:t>
             </w:r>
           </w:p>
         </w:tc>
@@ -6563,12 +6972,14 @@
             <w:vAlign w:val="center"/>
           </w:tcPr>
           <w:p>
+            <w:proofErr w:type="spellStart"/>
             <w:r>
               <w:t>D</w:t>
             </w:r>
             <w:r>
               <w:t>uracion</w:t>
             </w:r>
+            <w:proofErr w:type="spellEnd"/>
           </w:p>
         </w:tc>
         <w:tc>
@@ -6603,8 +7014,16 @@
               <w:rPr>
                 <w:lang w:val="es-AR"/>
               </w:rPr>
-              <w:t>Tiempo que lleva el wod</w:t>
-            </w:r>
+              <w:t xml:space="preserve">Tiempo que lleva el </w:t>
+            </w:r>
+            <w:proofErr w:type="spellStart"/>
+            <w:r>
+              <w:rPr>
+                <w:lang w:val="es-AR"/>
+              </w:rPr>
+              <w:t>wod</w:t>
+            </w:r>
+            <w:proofErr w:type="spellEnd"/>
           </w:p>
         </w:tc>
         <w:tc>
@@ -6660,6 +7079,7 @@
                 <w:bCs/>
               </w:rPr>
             </w:pPr>
+            <w:proofErr w:type="spellStart"/>
             <w:r>
               <w:rPr>
                 <w:b/>
@@ -6667,6 +7087,7 @@
               </w:rPr>
               <w:t>Clases</w:t>
             </w:r>
+            <w:proofErr w:type="spellEnd"/>
           </w:p>
         </w:tc>
         <w:tc>
@@ -6678,9 +7099,11 @@
             <w:vAlign w:val="center"/>
           </w:tcPr>
           <w:p>
+            <w:proofErr w:type="spellStart"/>
             <w:r>
               <w:t>Id_clase</w:t>
             </w:r>
+            <w:proofErr w:type="spellEnd"/>
           </w:p>
         </w:tc>
         <w:tc>
@@ -6706,9 +7129,19 @@
             <w:vAlign w:val="center"/>
           </w:tcPr>
           <w:p>
-            <w:r>
-              <w:t>Identificador único</w:t>
-            </w:r>
+            <w:proofErr w:type="spellStart"/>
+            <w:r>
+              <w:t>Identificador</w:t>
+            </w:r>
+            <w:proofErr w:type="spellEnd"/>
+            <w:r>
+              <w:t xml:space="preserve"> </w:t>
+            </w:r>
+            <w:proofErr w:type="spellStart"/>
+            <w:r>
+              <w:t>único</w:t>
+            </w:r>
+            <w:proofErr w:type="spellEnd"/>
           </w:p>
         </w:tc>
         <w:tc>
@@ -6766,9 +7199,11 @@
             <w:vAlign w:val="center"/>
           </w:tcPr>
           <w:p>
+            <w:proofErr w:type="spellStart"/>
             <w:r>
               <w:t>Id_entrenador</w:t>
             </w:r>
+            <w:proofErr w:type="spellEnd"/>
           </w:p>
         </w:tc>
         <w:tc>
@@ -6788,9 +7223,19 @@
             <w:vAlign w:val="center"/>
           </w:tcPr>
           <w:p>
-            <w:r>
-              <w:t>Identificador del entrenador</w:t>
-            </w:r>
+            <w:proofErr w:type="spellStart"/>
+            <w:r>
+              <w:t>Identificador</w:t>
+            </w:r>
+            <w:proofErr w:type="spellEnd"/>
+            <w:r>
+              <w:t xml:space="preserve"> del </w:t>
+            </w:r>
+            <w:proofErr w:type="spellStart"/>
+            <w:r>
+              <w:t>entrenador</w:t>
+            </w:r>
+            <w:proofErr w:type="spellEnd"/>
           </w:p>
         </w:tc>
         <w:tc>
@@ -6842,9 +7287,11 @@
             <w:vAlign w:val="center"/>
           </w:tcPr>
           <w:p>
+            <w:proofErr w:type="spellStart"/>
             <w:r>
               <w:t>Id_wod</w:t>
             </w:r>
+            <w:proofErr w:type="spellEnd"/>
           </w:p>
         </w:tc>
         <w:tc>
@@ -6864,9 +7311,19 @@
             <w:vAlign w:val="center"/>
           </w:tcPr>
           <w:p>
-            <w:r>
-              <w:t>Identificadordel wod</w:t>
-            </w:r>
+            <w:proofErr w:type="spellStart"/>
+            <w:r>
+              <w:t>Identificadordel</w:t>
+            </w:r>
+            <w:proofErr w:type="spellEnd"/>
+            <w:r>
+              <w:t xml:space="preserve"> </w:t>
+            </w:r>
+            <w:proofErr w:type="spellStart"/>
+            <w:r>
+              <w:t>wod</w:t>
+            </w:r>
+            <w:proofErr w:type="spellEnd"/>
           </w:p>
         </w:tc>
         <w:tc>
@@ -6918,9 +7375,11 @@
             <w:vAlign w:val="center"/>
           </w:tcPr>
           <w:p>
+            <w:proofErr w:type="spellStart"/>
             <w:r>
               <w:t>Tipo_clase</w:t>
             </w:r>
+            <w:proofErr w:type="spellEnd"/>
           </w:p>
         </w:tc>
         <w:tc>
@@ -6940,8 +7399,29 @@
             <w:vAlign w:val="center"/>
           </w:tcPr>
           <w:p>
-            <w:r>
-              <w:t>Ej: crossfit, funcional, weightlifting</w:t>
+            <w:proofErr w:type="spellStart"/>
+            <w:r>
+              <w:t>Ej</w:t>
+            </w:r>
+            <w:proofErr w:type="spellEnd"/>
+            <w:r>
+              <w:t xml:space="preserve">: </w:t>
+            </w:r>
+            <w:proofErr w:type="spellStart"/>
+            <w:r>
+              <w:t>crossfit</w:t>
+            </w:r>
+            <w:proofErr w:type="spellEnd"/>
+            <w:r>
+              <w:t xml:space="preserve">, </w:t>
+            </w:r>
+            <w:proofErr w:type="spellStart"/>
+            <w:r>
+              <w:t>funcional</w:t>
+            </w:r>
+            <w:proofErr w:type="spellEnd"/>
+            <w:r>
+              <w:t>, weightlifting</w:t>
             </w:r>
           </w:p>
         </w:tc>
@@ -6985,9 +7465,11 @@
             <w:vAlign w:val="center"/>
           </w:tcPr>
           <w:p>
+            <w:proofErr w:type="spellStart"/>
             <w:r>
               <w:t>Fecha</w:t>
             </w:r>
+            <w:proofErr w:type="spellEnd"/>
           </w:p>
         </w:tc>
         <w:tc>
@@ -7016,7 +7498,37 @@
               <w:rPr>
                 <w:lang w:val="es-AR"/>
               </w:rPr>
-              <w:t>Días que muestran las clases disponibles (ej:crossfit, funcional o weightlifting) de lunes a sábados.</w:t>
+              <w:t>Días que muestran las clases disponibles (</w:t>
+            </w:r>
+            <w:proofErr w:type="spellStart"/>
+            <w:proofErr w:type="gramStart"/>
+            <w:r>
+              <w:rPr>
+                <w:lang w:val="es-AR"/>
+              </w:rPr>
+              <w:t>ej:crossfit</w:t>
+            </w:r>
+            <w:proofErr w:type="spellEnd"/>
+            <w:proofErr w:type="gramEnd"/>
+            <w:r>
+              <w:rPr>
+                <w:lang w:val="es-AR"/>
+              </w:rPr>
+              <w:t xml:space="preserve">, funcional o </w:t>
+            </w:r>
+            <w:proofErr w:type="spellStart"/>
+            <w:r>
+              <w:rPr>
+                <w:lang w:val="es-AR"/>
+              </w:rPr>
+              <w:t>weightlifting</w:t>
+            </w:r>
+            <w:proofErr w:type="spellEnd"/>
+            <w:r>
+              <w:rPr>
+                <w:lang w:val="es-AR"/>
+              </w:rPr>
+              <w:t>) de lunes a sábados.</w:t>
             </w:r>
           </w:p>
         </w:tc>
@@ -7095,9 +7607,19 @@
             <w:vAlign w:val="center"/>
           </w:tcPr>
           <w:p>
-            <w:r>
-              <w:t>Horarios de las clases</w:t>
-            </w:r>
+            <w:proofErr w:type="spellStart"/>
+            <w:r>
+              <w:t>Horarios</w:t>
+            </w:r>
+            <w:proofErr w:type="spellEnd"/>
+            <w:r>
+              <w:t xml:space="preserve"> de las </w:t>
+            </w:r>
+            <w:proofErr w:type="spellStart"/>
+            <w:r>
+              <w:t>clases</w:t>
+            </w:r>
+            <w:proofErr w:type="spellEnd"/>
           </w:p>
         </w:tc>
         <w:tc>
@@ -7146,9 +7668,11 @@
             <w:vAlign w:val="center"/>
           </w:tcPr>
           <w:p>
+            <w:proofErr w:type="spellStart"/>
             <w:r>
               <w:t>Cupo_maximo</w:t>
             </w:r>
+            <w:proofErr w:type="spellEnd"/>
           </w:p>
         </w:tc>
         <w:tc>
@@ -7240,6 +7764,7 @@
                 <w:bCs/>
               </w:rPr>
             </w:pPr>
+            <w:proofErr w:type="spellStart"/>
             <w:r>
               <w:rPr>
                 <w:b/>
@@ -7247,6 +7772,7 @@
               </w:rPr>
               <w:t>Inscripciones</w:t>
             </w:r>
+            <w:proofErr w:type="spellEnd"/>
           </w:p>
         </w:tc>
         <w:tc>
@@ -7258,9 +7784,11 @@
             <w:vAlign w:val="center"/>
           </w:tcPr>
           <w:p>
+            <w:proofErr w:type="spellStart"/>
             <w:r>
               <w:t>Id_inscripcion</w:t>
             </w:r>
+            <w:proofErr w:type="spellEnd"/>
           </w:p>
         </w:tc>
         <w:tc>
@@ -7286,9 +7814,19 @@
             <w:vAlign w:val="center"/>
           </w:tcPr>
           <w:p>
-            <w:r>
-              <w:t>Identificador único</w:t>
-            </w:r>
+            <w:proofErr w:type="spellStart"/>
+            <w:r>
+              <w:t>Identificador</w:t>
+            </w:r>
+            <w:proofErr w:type="spellEnd"/>
+            <w:r>
+              <w:t xml:space="preserve"> </w:t>
+            </w:r>
+            <w:proofErr w:type="spellStart"/>
+            <w:r>
+              <w:t>único</w:t>
+            </w:r>
+            <w:proofErr w:type="spellEnd"/>
           </w:p>
         </w:tc>
         <w:tc>
@@ -7346,9 +7884,11 @@
             <w:vAlign w:val="center"/>
           </w:tcPr>
           <w:p>
+            <w:proofErr w:type="spellStart"/>
             <w:r>
               <w:t>Id_cliente</w:t>
             </w:r>
+            <w:proofErr w:type="spellEnd"/>
           </w:p>
         </w:tc>
         <w:tc>
@@ -7368,9 +7908,19 @@
             <w:vAlign w:val="center"/>
           </w:tcPr>
           <w:p>
-            <w:r>
-              <w:t>Identificador del cliente</w:t>
-            </w:r>
+            <w:proofErr w:type="spellStart"/>
+            <w:r>
+              <w:t>Identificador</w:t>
+            </w:r>
+            <w:proofErr w:type="spellEnd"/>
+            <w:r>
+              <w:t xml:space="preserve"> del </w:t>
+            </w:r>
+            <w:proofErr w:type="spellStart"/>
+            <w:r>
+              <w:t>cliente</w:t>
+            </w:r>
+            <w:proofErr w:type="spellEnd"/>
           </w:p>
         </w:tc>
         <w:tc>
@@ -7422,9 +7972,11 @@
             <w:vAlign w:val="center"/>
           </w:tcPr>
           <w:p>
+            <w:proofErr w:type="spellStart"/>
             <w:r>
               <w:t>Fecha_incripcion</w:t>
             </w:r>
+            <w:proofErr w:type="spellEnd"/>
           </w:p>
         </w:tc>
         <w:tc>
@@ -7590,6 +8142,7 @@
                 <w:bCs/>
               </w:rPr>
             </w:pPr>
+            <w:proofErr w:type="spellStart"/>
             <w:r>
               <w:rPr>
                 <w:b/>
@@ -7597,6 +8150,7 @@
               </w:rPr>
               <w:t>reservas</w:t>
             </w:r>
+            <w:proofErr w:type="spellEnd"/>
           </w:p>
         </w:tc>
         <w:tc>
@@ -7608,9 +8162,11 @@
             <w:vAlign w:val="center"/>
           </w:tcPr>
           <w:p>
+            <w:proofErr w:type="spellStart"/>
             <w:r>
               <w:t>Id_reserva</w:t>
             </w:r>
+            <w:proofErr w:type="spellEnd"/>
           </w:p>
         </w:tc>
         <w:tc>
@@ -7636,9 +8192,19 @@
             <w:vAlign w:val="center"/>
           </w:tcPr>
           <w:p>
-            <w:r>
-              <w:t>Identificador único</w:t>
-            </w:r>
+            <w:proofErr w:type="spellStart"/>
+            <w:r>
+              <w:t>Identificador</w:t>
+            </w:r>
+            <w:proofErr w:type="spellEnd"/>
+            <w:r>
+              <w:t xml:space="preserve"> </w:t>
+            </w:r>
+            <w:proofErr w:type="spellStart"/>
+            <w:r>
+              <w:t>único</w:t>
+            </w:r>
+            <w:proofErr w:type="spellEnd"/>
           </w:p>
         </w:tc>
         <w:tc>
@@ -7696,9 +8262,11 @@
             <w:vAlign w:val="center"/>
           </w:tcPr>
           <w:p>
+            <w:proofErr w:type="spellStart"/>
             <w:r>
               <w:t>Id_cliente</w:t>
             </w:r>
+            <w:proofErr w:type="spellEnd"/>
           </w:p>
         </w:tc>
         <w:tc>
@@ -7718,9 +8286,19 @@
             <w:vAlign w:val="center"/>
           </w:tcPr>
           <w:p>
-            <w:r>
-              <w:t>Identificador del cliente</w:t>
-            </w:r>
+            <w:proofErr w:type="spellStart"/>
+            <w:r>
+              <w:t>Identificador</w:t>
+            </w:r>
+            <w:proofErr w:type="spellEnd"/>
+            <w:r>
+              <w:t xml:space="preserve"> del </w:t>
+            </w:r>
+            <w:proofErr w:type="spellStart"/>
+            <w:r>
+              <w:t>cliente</w:t>
+            </w:r>
+            <w:proofErr w:type="spellEnd"/>
           </w:p>
         </w:tc>
         <w:tc>
@@ -7772,9 +8350,11 @@
             <w:vAlign w:val="center"/>
           </w:tcPr>
           <w:p>
+            <w:proofErr w:type="spellStart"/>
             <w:r>
               <w:t>Id_clase</w:t>
             </w:r>
+            <w:proofErr w:type="spellEnd"/>
           </w:p>
         </w:tc>
         <w:tc>
@@ -7794,9 +8374,19 @@
             <w:vAlign w:val="center"/>
           </w:tcPr>
           <w:p>
-            <w:r>
-              <w:t>Identificador de la clase</w:t>
-            </w:r>
+            <w:proofErr w:type="spellStart"/>
+            <w:r>
+              <w:t>Identificador</w:t>
+            </w:r>
+            <w:proofErr w:type="spellEnd"/>
+            <w:r>
+              <w:t xml:space="preserve"> de la </w:t>
+            </w:r>
+            <w:proofErr w:type="spellStart"/>
+            <w:r>
+              <w:t>clase</w:t>
+            </w:r>
+            <w:proofErr w:type="spellEnd"/>
           </w:p>
         </w:tc>
         <w:tc>
@@ -7848,9 +8438,11 @@
             <w:vAlign w:val="center"/>
           </w:tcPr>
           <w:p>
+            <w:proofErr w:type="spellStart"/>
             <w:r>
               <w:t>Fecha_reserva</w:t>
             </w:r>
+            <w:proofErr w:type="spellEnd"/>
           </w:p>
         </w:tc>
         <w:tc>
@@ -7879,7 +8471,21 @@
               <w:rPr>
                 <w:lang w:val="es-AR"/>
               </w:rPr>
-              <w:t>Día de la semana para anotarse de Lunes a Sábados</w:t>
+              <w:t xml:space="preserve">Día de la semana para anotarse de </w:t>
+            </w:r>
+            <w:proofErr w:type="gramStart"/>
+            <w:r>
+              <w:rPr>
+                <w:lang w:val="es-AR"/>
+              </w:rPr>
+              <w:t>Lunes</w:t>
+            </w:r>
+            <w:proofErr w:type="gramEnd"/>
+            <w:r>
+              <w:rPr>
+                <w:lang w:val="es-AR"/>
+              </w:rPr>
+              <w:t xml:space="preserve"> a Sábados</w:t>
             </w:r>
           </w:p>
         </w:tc>
@@ -7936,12 +8542,14 @@
             <w:vAlign w:val="center"/>
           </w:tcPr>
           <w:p>
+            <w:proofErr w:type="spellStart"/>
             <w:r>
               <w:t>H</w:t>
             </w:r>
             <w:r>
               <w:t>orario</w:t>
             </w:r>
+            <w:proofErr w:type="spellEnd"/>
           </w:p>
         </w:tc>
         <w:tc>
@@ -8125,6 +8733,7 @@
                 <w:bCs/>
               </w:rPr>
             </w:pPr>
+            <w:proofErr w:type="spellStart"/>
             <w:r>
               <w:rPr>
                 <w:b/>
@@ -8139,6 +8748,7 @@
               </w:rPr>
               <w:t>embresias</w:t>
             </w:r>
+            <w:proofErr w:type="spellEnd"/>
           </w:p>
         </w:tc>
         <w:tc>
@@ -8150,12 +8760,14 @@
             <w:vAlign w:val="center"/>
           </w:tcPr>
           <w:p>
+            <w:proofErr w:type="spellStart"/>
             <w:r>
               <w:t>Id</w:t>
             </w:r>
             <w:r>
               <w:t>_plan</w:t>
             </w:r>
+            <w:proofErr w:type="spellEnd"/>
           </w:p>
         </w:tc>
         <w:tc>
@@ -8181,9 +8793,19 @@
             <w:vAlign w:val="center"/>
           </w:tcPr>
           <w:p>
-            <w:r>
-              <w:t>Identificador único</w:t>
-            </w:r>
+            <w:proofErr w:type="spellStart"/>
+            <w:r>
+              <w:t>Identificador</w:t>
+            </w:r>
+            <w:proofErr w:type="spellEnd"/>
+            <w:r>
+              <w:t xml:space="preserve"> </w:t>
+            </w:r>
+            <w:proofErr w:type="spellStart"/>
+            <w:r>
+              <w:t>único</w:t>
+            </w:r>
+            <w:proofErr w:type="spellEnd"/>
           </w:p>
         </w:tc>
         <w:tc>
@@ -8241,9 +8863,11 @@
             <w:vAlign w:val="center"/>
           </w:tcPr>
           <w:p>
+            <w:proofErr w:type="spellStart"/>
             <w:r>
               <w:t>Nombre</w:t>
             </w:r>
+            <w:proofErr w:type="spellEnd"/>
           </w:p>
         </w:tc>
         <w:tc>
@@ -8272,7 +8896,21 @@
               <w:rPr>
                 <w:lang w:val="es-AR"/>
               </w:rPr>
-              <w:t xml:space="preserve">Nombre de la membresía, ej: </w:t>
+              <w:t xml:space="preserve">Nombre de la membresía, </w:t>
+            </w:r>
+            <w:proofErr w:type="spellStart"/>
+            <w:r>
+              <w:rPr>
+                <w:lang w:val="es-AR"/>
+              </w:rPr>
+              <w:t>ej</w:t>
+            </w:r>
+            <w:proofErr w:type="spellEnd"/>
+            <w:r>
+              <w:rPr>
+                <w:lang w:val="es-AR"/>
+              </w:rPr>
+              <w:t xml:space="preserve">: </w:t>
             </w:r>
             <w:r>
               <w:rPr>
@@ -8353,9 +8991,11 @@
             <w:vAlign w:val="center"/>
           </w:tcPr>
           <w:p>
+            <w:proofErr w:type="spellStart"/>
             <w:r>
               <w:t>Descripcion</w:t>
             </w:r>
+            <w:proofErr w:type="spellEnd"/>
           </w:p>
         </w:tc>
         <w:tc>
@@ -8380,16 +9020,24 @@
                 <w:lang w:val="es-AR"/>
               </w:rPr>
             </w:pPr>
+            <w:proofErr w:type="spellStart"/>
             <w:r>
               <w:rPr>
                 <w:lang w:val="es-AR"/>
               </w:rPr>
-              <w:t xml:space="preserve">Descirpción de lo que implica un pack de </w:t>
-            </w:r>
+              <w:t>Descirpción</w:t>
+            </w:r>
+            <w:proofErr w:type="spellEnd"/>
             <w:r>
               <w:rPr>
                 <w:lang w:val="es-AR"/>
               </w:rPr>
+              <w:t xml:space="preserve"> de lo que implica un pack de </w:t>
+            </w:r>
+            <w:r>
+              <w:rPr>
+                <w:lang w:val="es-AR"/>
+              </w:rPr>
               <w:t>básico</w:t>
             </w:r>
             <w:r>
@@ -8408,7 +9056,21 @@
               <w:rPr>
                 <w:lang w:val="es-AR"/>
               </w:rPr>
-              <w:t xml:space="preserve"> e ilimitado, corerspondiendo a 8</w:t>
+              <w:t xml:space="preserve"> e ilimitado, </w:t>
+            </w:r>
+            <w:proofErr w:type="spellStart"/>
+            <w:r>
+              <w:rPr>
+                <w:lang w:val="es-AR"/>
+              </w:rPr>
+              <w:t>corerspondiendo</w:t>
+            </w:r>
+            <w:proofErr w:type="spellEnd"/>
+            <w:r>
+              <w:rPr>
+                <w:lang w:val="es-AR"/>
+              </w:rPr>
+              <w:t xml:space="preserve"> a 8</w:t>
             </w:r>
             <w:r>
               <w:rPr>
@@ -8495,9 +9157,11 @@
             <w:vAlign w:val="center"/>
           </w:tcPr>
           <w:p>
+            <w:proofErr w:type="spellStart"/>
             <w:r>
               <w:t>Precio</w:t>
             </w:r>
+            <w:proofErr w:type="spellEnd"/>
           </w:p>
         </w:tc>
         <w:tc>
@@ -8517,8 +9181,21 @@
             <w:vAlign w:val="center"/>
           </w:tcPr>
           <w:p>
-            <w:r>
-              <w:t>Precio de cada pack</w:t>
+            <w:proofErr w:type="spellStart"/>
+            <w:r>
+              <w:t>Precio</w:t>
+            </w:r>
+            <w:proofErr w:type="spellEnd"/>
+            <w:r>
+              <w:t xml:space="preserve"> de </w:t>
+            </w:r>
+            <w:proofErr w:type="spellStart"/>
+            <w:r>
+              <w:t>cada</w:t>
+            </w:r>
+            <w:proofErr w:type="spellEnd"/>
+            <w:r>
+              <w:t xml:space="preserve"> pack</w:t>
             </w:r>
           </w:p>
         </w:tc>
@@ -8562,9 +9239,11 @@
             <w:vAlign w:val="center"/>
           </w:tcPr>
           <w:p>
+            <w:proofErr w:type="spellStart"/>
             <w:r>
               <w:t>Duracion_dias</w:t>
             </w:r>
+            <w:proofErr w:type="spellEnd"/>
           </w:p>
         </w:tc>
         <w:tc>
@@ -8650,9 +9329,11 @@
             <w:vAlign w:val="center"/>
           </w:tcPr>
           <w:p>
+            <w:proofErr w:type="spellStart"/>
             <w:r>
               <w:t>Limite_clases</w:t>
             </w:r>
+            <w:proofErr w:type="spellEnd"/>
           </w:p>
         </w:tc>
         <w:tc>
@@ -8836,6 +9517,7 @@
                 <w:bCs/>
               </w:rPr>
             </w:pPr>
+            <w:proofErr w:type="spellStart"/>
             <w:r>
               <w:rPr>
                 <w:b/>
@@ -8844,6 +9526,7 @@
               <w:lastRenderedPageBreak/>
               <w:t>pagos</w:t>
             </w:r>
+            <w:proofErr w:type="spellEnd"/>
           </w:p>
         </w:tc>
         <w:tc>
@@ -8855,9 +9538,11 @@
             <w:vAlign w:val="center"/>
           </w:tcPr>
           <w:p>
+            <w:proofErr w:type="spellStart"/>
             <w:r>
               <w:t>Id_pago</w:t>
             </w:r>
+            <w:proofErr w:type="spellEnd"/>
           </w:p>
         </w:tc>
         <w:tc>
@@ -8883,9 +9568,19 @@
             <w:vAlign w:val="center"/>
           </w:tcPr>
           <w:p>
-            <w:r>
-              <w:t>Identificador único</w:t>
-            </w:r>
+            <w:proofErr w:type="spellStart"/>
+            <w:r>
+              <w:t>Identificador</w:t>
+            </w:r>
+            <w:proofErr w:type="spellEnd"/>
+            <w:r>
+              <w:t xml:space="preserve"> </w:t>
+            </w:r>
+            <w:proofErr w:type="spellStart"/>
+            <w:r>
+              <w:t>único</w:t>
+            </w:r>
+            <w:proofErr w:type="spellEnd"/>
           </w:p>
         </w:tc>
         <w:tc>
@@ -8943,9 +9638,11 @@
             <w:vAlign w:val="center"/>
           </w:tcPr>
           <w:p>
+            <w:proofErr w:type="spellStart"/>
             <w:r>
               <w:t>Id_cliente</w:t>
             </w:r>
+            <w:proofErr w:type="spellEnd"/>
           </w:p>
         </w:tc>
         <w:tc>
@@ -8965,9 +9662,19 @@
             <w:vAlign w:val="center"/>
           </w:tcPr>
           <w:p>
-            <w:r>
-              <w:t>Identificador del cliente</w:t>
-            </w:r>
+            <w:proofErr w:type="spellStart"/>
+            <w:r>
+              <w:t>Identificador</w:t>
+            </w:r>
+            <w:proofErr w:type="spellEnd"/>
+            <w:r>
+              <w:t xml:space="preserve"> del </w:t>
+            </w:r>
+            <w:proofErr w:type="spellStart"/>
+            <w:r>
+              <w:t>cliente</w:t>
+            </w:r>
+            <w:proofErr w:type="spellEnd"/>
           </w:p>
         </w:tc>
         <w:tc>
@@ -9012,9 +9719,11 @@
             <w:vAlign w:val="center"/>
           </w:tcPr>
           <w:p>
+            <w:proofErr w:type="spellStart"/>
             <w:r>
               <w:t>Id_membresia</w:t>
             </w:r>
+            <w:proofErr w:type="spellEnd"/>
           </w:p>
         </w:tc>
         <w:tc>
@@ -9034,9 +9743,19 @@
             <w:vAlign w:val="center"/>
           </w:tcPr>
           <w:p>
-            <w:r>
-              <w:t>Identificador membresía</w:t>
-            </w:r>
+            <w:proofErr w:type="spellStart"/>
+            <w:r>
+              <w:t>Identificador</w:t>
+            </w:r>
+            <w:proofErr w:type="spellEnd"/>
+            <w:r>
+              <w:t xml:space="preserve"> </w:t>
+            </w:r>
+            <w:proofErr w:type="spellStart"/>
+            <w:r>
+              <w:t>membresía</w:t>
+            </w:r>
+            <w:proofErr w:type="spellEnd"/>
           </w:p>
         </w:tc>
         <w:tc>
@@ -9088,9 +9807,11 @@
             <w:vAlign w:val="center"/>
           </w:tcPr>
           <w:p>
+            <w:proofErr w:type="spellStart"/>
             <w:r>
               <w:t>Id_cliente_membresia</w:t>
             </w:r>
+            <w:proofErr w:type="spellEnd"/>
           </w:p>
         </w:tc>
         <w:tc>
@@ -9110,9 +9831,27 @@
             <w:vAlign w:val="center"/>
           </w:tcPr>
           <w:p>
-            <w:r>
-              <w:t>Identificador cliente membresía</w:t>
-            </w:r>
+            <w:proofErr w:type="spellStart"/>
+            <w:r>
+              <w:t>Identificador</w:t>
+            </w:r>
+            <w:proofErr w:type="spellEnd"/>
+            <w:r>
+              <w:t xml:space="preserve"> </w:t>
+            </w:r>
+            <w:proofErr w:type="spellStart"/>
+            <w:r>
+              <w:t>cliente</w:t>
+            </w:r>
+            <w:proofErr w:type="spellEnd"/>
+            <w:r>
+              <w:t xml:space="preserve"> </w:t>
+            </w:r>
+            <w:proofErr w:type="spellStart"/>
+            <w:r>
+              <w:t>membresía</w:t>
+            </w:r>
+            <w:proofErr w:type="spellEnd"/>
           </w:p>
         </w:tc>
         <w:tc>
@@ -9168,9 +9907,11 @@
             <w:vAlign w:val="center"/>
           </w:tcPr>
           <w:p>
+            <w:proofErr w:type="spellStart"/>
             <w:r>
               <w:t>Fecha_pago</w:t>
             </w:r>
+            <w:proofErr w:type="spellEnd"/>
           </w:p>
         </w:tc>
         <w:tc>
@@ -9260,9 +10001,11 @@
             <w:vAlign w:val="center"/>
           </w:tcPr>
           <w:p>
+            <w:proofErr w:type="spellStart"/>
             <w:r>
               <w:t>Metodo_pago</w:t>
             </w:r>
+            <w:proofErr w:type="spellEnd"/>
           </w:p>
         </w:tc>
         <w:tc>
@@ -9457,6 +10200,7 @@
                 <w:bCs/>
               </w:rPr>
             </w:pPr>
+            <w:proofErr w:type="spellStart"/>
             <w:r>
               <w:rPr>
                 <w:b/>
@@ -9464,6 +10208,7 @@
               </w:rPr>
               <w:t>entrenador_cliente</w:t>
             </w:r>
+            <w:proofErr w:type="spellEnd"/>
           </w:p>
         </w:tc>
         <w:tc>
@@ -9476,9 +10221,11 @@
             <w:vAlign w:val="center"/>
           </w:tcPr>
           <w:p>
+            <w:proofErr w:type="spellStart"/>
             <w:r>
               <w:t>id_entrenador</w:t>
             </w:r>
+            <w:proofErr w:type="spellEnd"/>
           </w:p>
         </w:tc>
         <w:tc>
@@ -9506,9 +10253,19 @@
             <w:vAlign w:val="center"/>
           </w:tcPr>
           <w:p>
-            <w:r>
-              <w:t>Identificador del entrenador</w:t>
-            </w:r>
+            <w:proofErr w:type="spellStart"/>
+            <w:r>
+              <w:t>Identificador</w:t>
+            </w:r>
+            <w:proofErr w:type="spellEnd"/>
+            <w:r>
+              <w:t xml:space="preserve"> del </w:t>
+            </w:r>
+            <w:proofErr w:type="spellStart"/>
+            <w:r>
+              <w:t>entrenador</w:t>
+            </w:r>
+            <w:proofErr w:type="spellEnd"/>
           </w:p>
         </w:tc>
         <w:tc>
@@ -9576,9 +10333,11 @@
             <w:vAlign w:val="center"/>
           </w:tcPr>
           <w:p>
+            <w:proofErr w:type="spellStart"/>
             <w:r>
               <w:t>id_cliente</w:t>
             </w:r>
+            <w:proofErr w:type="spellEnd"/>
           </w:p>
         </w:tc>
         <w:tc>
@@ -9604,9 +10363,19 @@
             <w:vAlign w:val="center"/>
           </w:tcPr>
           <w:p>
-            <w:r>
-              <w:t>Identificador del cliente</w:t>
-            </w:r>
+            <w:proofErr w:type="spellStart"/>
+            <w:r>
+              <w:t>Identificador</w:t>
+            </w:r>
+            <w:proofErr w:type="spellEnd"/>
+            <w:r>
+              <w:t xml:space="preserve"> del </w:t>
+            </w:r>
+            <w:proofErr w:type="spellStart"/>
+            <w:r>
+              <w:t>cliente</w:t>
+            </w:r>
+            <w:proofErr w:type="spellEnd"/>
           </w:p>
         </w:tc>
         <w:tc>
@@ -9668,6 +10437,7 @@
                 <w:bCs/>
               </w:rPr>
             </w:pPr>
+            <w:proofErr w:type="spellStart"/>
             <w:r>
               <w:rPr>
                 <w:b/>
@@ -9675,6 +10445,7 @@
               </w:rPr>
               <w:t>Cliente_membresias</w:t>
             </w:r>
+            <w:proofErr w:type="spellEnd"/>
           </w:p>
         </w:tc>
         <w:tc>
@@ -9686,9 +10457,11 @@
             <w:vAlign w:val="center"/>
           </w:tcPr>
           <w:p>
+            <w:proofErr w:type="spellStart"/>
             <w:r>
               <w:t>Id_cliente_membresia</w:t>
             </w:r>
+            <w:proofErr w:type="spellEnd"/>
           </w:p>
         </w:tc>
         <w:tc>
@@ -9714,9 +10487,27 @@
             <w:vAlign w:val="center"/>
           </w:tcPr>
           <w:p>
-            <w:r>
-              <w:t>Identificador cliente membresia</w:t>
-            </w:r>
+            <w:proofErr w:type="spellStart"/>
+            <w:r>
+              <w:t>Identificador</w:t>
+            </w:r>
+            <w:proofErr w:type="spellEnd"/>
+            <w:r>
+              <w:t xml:space="preserve"> </w:t>
+            </w:r>
+            <w:proofErr w:type="spellStart"/>
+            <w:r>
+              <w:t>cliente</w:t>
+            </w:r>
+            <w:proofErr w:type="spellEnd"/>
+            <w:r>
+              <w:t xml:space="preserve"> </w:t>
+            </w:r>
+            <w:proofErr w:type="spellStart"/>
+            <w:r>
+              <w:t>membresia</w:t>
+            </w:r>
+            <w:proofErr w:type="spellEnd"/>
           </w:p>
         </w:tc>
         <w:tc>
@@ -9782,9 +10573,11 @@
             <w:vAlign w:val="center"/>
           </w:tcPr>
           <w:p>
+            <w:proofErr w:type="spellStart"/>
             <w:r>
               <w:t>Id_cliente</w:t>
             </w:r>
+            <w:proofErr w:type="spellEnd"/>
           </w:p>
         </w:tc>
         <w:tc>
@@ -9804,9 +10597,19 @@
             <w:vAlign w:val="center"/>
           </w:tcPr>
           <w:p>
-            <w:r>
-              <w:t>Identificador cliente</w:t>
-            </w:r>
+            <w:proofErr w:type="spellStart"/>
+            <w:r>
+              <w:t>Identificador</w:t>
+            </w:r>
+            <w:proofErr w:type="spellEnd"/>
+            <w:r>
+              <w:t xml:space="preserve"> </w:t>
+            </w:r>
+            <w:proofErr w:type="spellStart"/>
+            <w:r>
+              <w:t>cliente</w:t>
+            </w:r>
+            <w:proofErr w:type="spellEnd"/>
           </w:p>
         </w:tc>
         <w:tc>
@@ -9866,9 +10669,11 @@
             <w:vAlign w:val="center"/>
           </w:tcPr>
           <w:p>
+            <w:proofErr w:type="spellStart"/>
             <w:r>
               <w:t>Id_plan</w:t>
             </w:r>
+            <w:proofErr w:type="spellEnd"/>
           </w:p>
         </w:tc>
         <w:tc>
@@ -9888,8 +10693,13 @@
             <w:vAlign w:val="center"/>
           </w:tcPr>
           <w:p>
-            <w:r>
-              <w:t>Identificador del plan</w:t>
+            <w:proofErr w:type="spellStart"/>
+            <w:r>
+              <w:t>Identificador</w:t>
+            </w:r>
+            <w:proofErr w:type="spellEnd"/>
+            <w:r>
+              <w:t xml:space="preserve"> del plan</w:t>
             </w:r>
           </w:p>
         </w:tc>
@@ -9950,9 +10760,11 @@
             <w:vAlign w:val="center"/>
           </w:tcPr>
           <w:p>
+            <w:proofErr w:type="spellStart"/>
             <w:r>
               <w:t>Fecha_inicio</w:t>
             </w:r>
+            <w:proofErr w:type="spellEnd"/>
           </w:p>
         </w:tc>
         <w:tc>
@@ -9972,9 +10784,27 @@
             <w:vAlign w:val="center"/>
           </w:tcPr>
           <w:p>
-            <w:r>
-              <w:t>Fecha incio membresía</w:t>
-            </w:r>
+            <w:proofErr w:type="spellStart"/>
+            <w:r>
+              <w:t>Fecha</w:t>
+            </w:r>
+            <w:proofErr w:type="spellEnd"/>
+            <w:r>
+              <w:t xml:space="preserve"> </w:t>
+            </w:r>
+            <w:proofErr w:type="spellStart"/>
+            <w:r>
+              <w:t>incio</w:t>
+            </w:r>
+            <w:proofErr w:type="spellEnd"/>
+            <w:r>
+              <w:t xml:space="preserve"> </w:t>
+            </w:r>
+            <w:proofErr w:type="spellStart"/>
+            <w:r>
+              <w:t>membresía</w:t>
+            </w:r>
+            <w:proofErr w:type="spellEnd"/>
           </w:p>
         </w:tc>
         <w:tc>
@@ -10026,9 +10856,11 @@
             <w:vAlign w:val="center"/>
           </w:tcPr>
           <w:p>
+            <w:proofErr w:type="spellStart"/>
             <w:r>
               <w:t>Fecha_fin</w:t>
             </w:r>
+            <w:proofErr w:type="spellEnd"/>
           </w:p>
         </w:tc>
         <w:tc>
@@ -10048,9 +10880,19 @@
             <w:vAlign w:val="center"/>
           </w:tcPr>
           <w:p>
-            <w:r>
-              <w:t>Fecha fin membresía</w:t>
-            </w:r>
+            <w:proofErr w:type="spellStart"/>
+            <w:r>
+              <w:t>Fecha</w:t>
+            </w:r>
+            <w:proofErr w:type="spellEnd"/>
+            <w:r>
+              <w:t xml:space="preserve"> fin </w:t>
+            </w:r>
+            <w:proofErr w:type="spellStart"/>
+            <w:r>
+              <w:t>membresía</w:t>
+            </w:r>
+            <w:proofErr w:type="spellEnd"/>
           </w:p>
         </w:tc>
         <w:tc>
@@ -10127,9 +10969,19 @@
             <w:vAlign w:val="center"/>
           </w:tcPr>
           <w:p>
-            <w:r>
-              <w:t>Activo o Inactivo</w:t>
-            </w:r>
+            <w:proofErr w:type="spellStart"/>
+            <w:r>
+              <w:t>Activo</w:t>
+            </w:r>
+            <w:proofErr w:type="spellEnd"/>
+            <w:r>
+              <w:t xml:space="preserve"> o </w:t>
+            </w:r>
+            <w:proofErr w:type="spellStart"/>
+            <w:r>
+              <w:t>Inactivo</w:t>
+            </w:r>
+            <w:proofErr w:type="spellEnd"/>
           </w:p>
         </w:tc>
         <w:tc>
@@ -10212,6 +11064,7 @@
           <w:lang w:val="es-MX"/>
         </w:rPr>
       </w:pPr>
+      <w:proofErr w:type="spellStart"/>
       <w:r>
         <w:rPr>
           <w:rFonts w:ascii="Arial" w:hAnsi="Arial" w:cs="Arial"/>
@@ -10221,6 +11074,7 @@
         </w:rPr>
         <w:t>Vista_clientes_activos</w:t>
       </w:r>
+      <w:proofErr w:type="spellEnd"/>
     </w:p>
     <w:p>
       <w:pPr>
@@ -10235,7 +11089,55 @@
           <w:rFonts w:ascii="Arial" w:hAnsi="Arial" w:cs="Arial"/>
           <w:lang w:val="es-MX"/>
         </w:rPr>
-        <w:t>El objetivo de esta vista es ver rápidamente los clientes que están habilitados. Nos muestra: Id_cliente, nombre, apellido, dni, fecha_registro.</w:t>
+        <w:t xml:space="preserve">El objetivo de esta vista es ver rápidamente los clientes que están habilitados. Nos muestra: </w:t>
+      </w:r>
+      <w:proofErr w:type="spellStart"/>
+      <w:r>
+        <w:rPr>
+          <w:rFonts w:ascii="Arial" w:hAnsi="Arial" w:cs="Arial"/>
+          <w:lang w:val="es-MX"/>
+        </w:rPr>
+        <w:t>Id_cliente</w:t>
+      </w:r>
+      <w:proofErr w:type="spellEnd"/>
+      <w:r>
+        <w:rPr>
+          <w:rFonts w:ascii="Arial" w:hAnsi="Arial" w:cs="Arial"/>
+          <w:lang w:val="es-MX"/>
+        </w:rPr>
+        <w:t xml:space="preserve">, nombre, apellido, </w:t>
+      </w:r>
+      <w:proofErr w:type="spellStart"/>
+      <w:r>
+        <w:rPr>
+          <w:rFonts w:ascii="Arial" w:hAnsi="Arial" w:cs="Arial"/>
+          <w:lang w:val="es-MX"/>
+        </w:rPr>
+        <w:t>dni</w:t>
+      </w:r>
+      <w:proofErr w:type="spellEnd"/>
+      <w:r>
+        <w:rPr>
+          <w:rFonts w:ascii="Arial" w:hAnsi="Arial" w:cs="Arial"/>
+          <w:lang w:val="es-MX"/>
+        </w:rPr>
+        <w:t xml:space="preserve">, </w:t>
+      </w:r>
+      <w:proofErr w:type="spellStart"/>
+      <w:r>
+        <w:rPr>
+          <w:rFonts w:ascii="Arial" w:hAnsi="Arial" w:cs="Arial"/>
+          <w:lang w:val="es-MX"/>
+        </w:rPr>
+        <w:t>fecha_registro</w:t>
+      </w:r>
+      <w:proofErr w:type="spellEnd"/>
+      <w:r>
+        <w:rPr>
+          <w:rFonts w:ascii="Arial" w:hAnsi="Arial" w:cs="Arial"/>
+          <w:lang w:val="es-MX"/>
+        </w:rPr>
+        <w:t>.</w:t>
       </w:r>
     </w:p>
     <w:p>
@@ -10253,6 +11155,7 @@
           <w:lang w:val="es-MX"/>
         </w:rPr>
       </w:pPr>
+      <w:proofErr w:type="spellStart"/>
       <w:r>
         <w:rPr>
           <w:rFonts w:ascii="Arial" w:hAnsi="Arial" w:cs="Arial"/>
@@ -10262,6 +11165,7 @@
         </w:rPr>
         <w:t>Vista_clases_completas</w:t>
       </w:r>
+      <w:proofErr w:type="spellEnd"/>
     </w:p>
     <w:p>
       <w:pPr>
@@ -10276,7 +11180,23 @@
           <w:rFonts w:ascii="Arial" w:hAnsi="Arial" w:cs="Arial"/>
           <w:lang w:val="es-MX"/>
         </w:rPr>
-        <w:t>El objetivo es mostrar toda la info relevante de una clase</w:t>
+        <w:t xml:space="preserve">El objetivo es mostrar toda la </w:t>
+      </w:r>
+      <w:proofErr w:type="spellStart"/>
+      <w:r>
+        <w:rPr>
+          <w:rFonts w:ascii="Arial" w:hAnsi="Arial" w:cs="Arial"/>
+          <w:lang w:val="es-MX"/>
+        </w:rPr>
+        <w:t>info</w:t>
+      </w:r>
+      <w:proofErr w:type="spellEnd"/>
+      <w:r>
+        <w:rPr>
+          <w:rFonts w:ascii="Arial" w:hAnsi="Arial" w:cs="Arial"/>
+          <w:lang w:val="es-MX"/>
+        </w:rPr>
+        <w:t xml:space="preserve"> relevante de una clase</w:t>
       </w:r>
       <w:r>
         <w:rPr>
@@ -10290,8 +11210,17 @@
           <w:rFonts w:ascii="Arial" w:hAnsi="Arial" w:cs="Arial"/>
           <w:lang w:val="es-MX"/>
         </w:rPr>
-        <w:t>. Unimos las tablas clases, entrenadores y wods</w:t>
-      </w:r>
+        <w:t xml:space="preserve">. Unimos las tablas clases, entrenadores y </w:t>
+      </w:r>
+      <w:proofErr w:type="spellStart"/>
+      <w:r>
+        <w:rPr>
+          <w:rFonts w:ascii="Arial" w:hAnsi="Arial" w:cs="Arial"/>
+          <w:lang w:val="es-MX"/>
+        </w:rPr>
+        <w:t>wods</w:t>
+      </w:r>
+      <w:proofErr w:type="spellEnd"/>
       <w:r>
         <w:rPr>
           <w:rFonts w:ascii="Arial" w:hAnsi="Arial" w:cs="Arial"/>
@@ -10327,7 +11256,23 @@
           <w:rFonts w:ascii="Arial" w:hAnsi="Arial" w:cs="Arial"/>
           <w:lang w:val="es-MX"/>
         </w:rPr>
-        <w:t xml:space="preserve"> id_clase,</w:t>
+        <w:t xml:space="preserve"> </w:t>
+      </w:r>
+      <w:proofErr w:type="spellStart"/>
+      <w:r>
+        <w:rPr>
+          <w:rFonts w:ascii="Arial" w:hAnsi="Arial" w:cs="Arial"/>
+          <w:lang w:val="es-MX"/>
+        </w:rPr>
+        <w:t>id_clase</w:t>
+      </w:r>
+      <w:proofErr w:type="spellEnd"/>
+      <w:r>
+        <w:rPr>
+          <w:rFonts w:ascii="Arial" w:hAnsi="Arial" w:cs="Arial"/>
+          <w:lang w:val="es-MX"/>
+        </w:rPr>
+        <w:t>,</w:t>
       </w:r>
       <w:r>
         <w:rPr>
@@ -10348,15 +11293,33 @@
           <w:rFonts w:ascii="Arial" w:hAnsi="Arial" w:cs="Arial"/>
           <w:lang w:val="es-MX"/>
         </w:rPr>
-        <w:t xml:space="preserve"> tipo_clase</w:t>
-      </w:r>
-      <w:r>
-        <w:rPr>
-          <w:rFonts w:ascii="Arial" w:hAnsi="Arial" w:cs="Arial"/>
-          <w:lang w:val="es-MX"/>
-        </w:rPr>
-        <w:t xml:space="preserve"> y cupo_maximo</w:t>
-      </w:r>
+        <w:t xml:space="preserve"> </w:t>
+      </w:r>
+      <w:proofErr w:type="spellStart"/>
+      <w:r>
+        <w:rPr>
+          <w:rFonts w:ascii="Arial" w:hAnsi="Arial" w:cs="Arial"/>
+          <w:lang w:val="es-MX"/>
+        </w:rPr>
+        <w:t>tipo_clase</w:t>
+      </w:r>
+      <w:proofErr w:type="spellEnd"/>
+      <w:r>
+        <w:rPr>
+          <w:rFonts w:ascii="Arial" w:hAnsi="Arial" w:cs="Arial"/>
+          <w:lang w:val="es-MX"/>
+        </w:rPr>
+        <w:t xml:space="preserve"> y </w:t>
+      </w:r>
+      <w:proofErr w:type="spellStart"/>
+      <w:r>
+        <w:rPr>
+          <w:rFonts w:ascii="Arial" w:hAnsi="Arial" w:cs="Arial"/>
+          <w:lang w:val="es-MX"/>
+        </w:rPr>
+        <w:t>cupo_maximo</w:t>
+      </w:r>
+      <w:proofErr w:type="spellEnd"/>
       <w:r>
         <w:rPr>
           <w:rFonts w:ascii="Arial" w:hAnsi="Arial" w:cs="Arial"/>
@@ -10378,7 +11341,39 @@
           <w:rFonts w:ascii="Arial" w:hAnsi="Arial" w:cs="Arial"/>
           <w:lang w:val="es-MX"/>
         </w:rPr>
-        <w:t>De la tabla entrenadores usamos las columnas nombre como nombre_entrenador y apellido como apellido_entrenador.</w:t>
+        <w:t xml:space="preserve">De la tabla entrenadores usamos las columnas nombre como </w:t>
+      </w:r>
+      <w:proofErr w:type="spellStart"/>
+      <w:r>
+        <w:rPr>
+          <w:rFonts w:ascii="Arial" w:hAnsi="Arial" w:cs="Arial"/>
+          <w:lang w:val="es-MX"/>
+        </w:rPr>
+        <w:t>nombre_entrenador</w:t>
+      </w:r>
+      <w:proofErr w:type="spellEnd"/>
+      <w:r>
+        <w:rPr>
+          <w:rFonts w:ascii="Arial" w:hAnsi="Arial" w:cs="Arial"/>
+          <w:lang w:val="es-MX"/>
+        </w:rPr>
+        <w:t xml:space="preserve"> y apellido como </w:t>
+      </w:r>
+      <w:proofErr w:type="spellStart"/>
+      <w:r>
+        <w:rPr>
+          <w:rFonts w:ascii="Arial" w:hAnsi="Arial" w:cs="Arial"/>
+          <w:lang w:val="es-MX"/>
+        </w:rPr>
+        <w:t>apellido_entrenador</w:t>
+      </w:r>
+      <w:proofErr w:type="spellEnd"/>
+      <w:r>
+        <w:rPr>
+          <w:rFonts w:ascii="Arial" w:hAnsi="Arial" w:cs="Arial"/>
+          <w:lang w:val="es-MX"/>
+        </w:rPr>
+        <w:t>.</w:t>
       </w:r>
     </w:p>
     <w:p>
@@ -10395,7 +11390,39 @@
           <w:lang w:val="es-MX"/>
         </w:rPr>
         <w:lastRenderedPageBreak/>
-        <w:t>De la tabla wods usamos las columnas tipo como tipo_wod y duración.</w:t>
+        <w:t xml:space="preserve">De la tabla </w:t>
+      </w:r>
+      <w:proofErr w:type="spellStart"/>
+      <w:r>
+        <w:rPr>
+          <w:rFonts w:ascii="Arial" w:hAnsi="Arial" w:cs="Arial"/>
+          <w:lang w:val="es-MX"/>
+        </w:rPr>
+        <w:t>wods</w:t>
+      </w:r>
+      <w:proofErr w:type="spellEnd"/>
+      <w:r>
+        <w:rPr>
+          <w:rFonts w:ascii="Arial" w:hAnsi="Arial" w:cs="Arial"/>
+          <w:lang w:val="es-MX"/>
+        </w:rPr>
+        <w:t xml:space="preserve"> usamos las columnas tipo como </w:t>
+      </w:r>
+      <w:proofErr w:type="spellStart"/>
+      <w:r>
+        <w:rPr>
+          <w:rFonts w:ascii="Arial" w:hAnsi="Arial" w:cs="Arial"/>
+          <w:lang w:val="es-MX"/>
+        </w:rPr>
+        <w:t>tipo_wod</w:t>
+      </w:r>
+      <w:proofErr w:type="spellEnd"/>
+      <w:r>
+        <w:rPr>
+          <w:rFonts w:ascii="Arial" w:hAnsi="Arial" w:cs="Arial"/>
+          <w:lang w:val="es-MX"/>
+        </w:rPr>
+        <w:t xml:space="preserve"> y duración.</w:t>
       </w:r>
     </w:p>
     <w:p>
@@ -10413,6 +11440,7 @@
           <w:lang w:val="es-MX"/>
         </w:rPr>
       </w:pPr>
+      <w:proofErr w:type="spellStart"/>
       <w:r>
         <w:rPr>
           <w:rFonts w:ascii="Arial" w:hAnsi="Arial" w:cs="Arial"/>
@@ -10422,6 +11450,7 @@
         </w:rPr>
         <w:t>Vista_reservas_por_clase</w:t>
       </w:r>
+      <w:proofErr w:type="spellEnd"/>
     </w:p>
     <w:p>
       <w:pPr>
@@ -10450,7 +11479,23 @@
           <w:rFonts w:ascii="Arial" w:hAnsi="Arial" w:cs="Arial"/>
           <w:lang w:val="es-MX"/>
         </w:rPr>
-        <w:t xml:space="preserve"> clases y reservas, hacer un JOIN y luego agrupar por clase con un GROUP BY; hacer un count de reservas para que me cuente el número de reservas.</w:t>
+        <w:t xml:space="preserve"> clases y reservas, hacer un JOIN y luego agrupar por clase con un GROUP BY; hacer un </w:t>
+      </w:r>
+      <w:proofErr w:type="spellStart"/>
+      <w:r>
+        <w:rPr>
+          <w:rFonts w:ascii="Arial" w:hAnsi="Arial" w:cs="Arial"/>
+          <w:lang w:val="es-MX"/>
+        </w:rPr>
+        <w:t>count</w:t>
+      </w:r>
+      <w:proofErr w:type="spellEnd"/>
+      <w:r>
+        <w:rPr>
+          <w:rFonts w:ascii="Arial" w:hAnsi="Arial" w:cs="Arial"/>
+          <w:lang w:val="es-MX"/>
+        </w:rPr>
+        <w:t xml:space="preserve"> de reservas para que me cuente el número de reservas.</w:t>
       </w:r>
     </w:p>
     <w:p>
@@ -10466,7 +11511,39 @@
           <w:rFonts w:ascii="Arial" w:hAnsi="Arial" w:cs="Arial"/>
           <w:lang w:val="es-MX"/>
         </w:rPr>
-        <w:t>Necesito de la tabla clases las columnas: id_clase, fecha, hora y tipo_clase.</w:t>
+        <w:t xml:space="preserve">Necesito de la tabla clases las columnas: </w:t>
+      </w:r>
+      <w:proofErr w:type="spellStart"/>
+      <w:r>
+        <w:rPr>
+          <w:rFonts w:ascii="Arial" w:hAnsi="Arial" w:cs="Arial"/>
+          <w:lang w:val="es-MX"/>
+        </w:rPr>
+        <w:t>id_clase</w:t>
+      </w:r>
+      <w:proofErr w:type="spellEnd"/>
+      <w:r>
+        <w:rPr>
+          <w:rFonts w:ascii="Arial" w:hAnsi="Arial" w:cs="Arial"/>
+          <w:lang w:val="es-MX"/>
+        </w:rPr>
+        <w:t xml:space="preserve">, fecha, hora y </w:t>
+      </w:r>
+      <w:proofErr w:type="spellStart"/>
+      <w:r>
+        <w:rPr>
+          <w:rFonts w:ascii="Arial" w:hAnsi="Arial" w:cs="Arial"/>
+          <w:lang w:val="es-MX"/>
+        </w:rPr>
+        <w:t>tipo_clase</w:t>
+      </w:r>
+      <w:proofErr w:type="spellEnd"/>
+      <w:r>
+        <w:rPr>
+          <w:rFonts w:ascii="Arial" w:hAnsi="Arial" w:cs="Arial"/>
+          <w:lang w:val="es-MX"/>
+        </w:rPr>
+        <w:t>.</w:t>
       </w:r>
     </w:p>
     <w:p>
@@ -10482,7 +11559,39 @@
           <w:rFonts w:ascii="Arial" w:hAnsi="Arial" w:cs="Arial"/>
           <w:lang w:val="es-MX"/>
         </w:rPr>
-        <w:t>De la tabla reservas uso la columna id_reserva para hacer el count.</w:t>
+        <w:t xml:space="preserve">De la tabla reservas uso la columna </w:t>
+      </w:r>
+      <w:proofErr w:type="spellStart"/>
+      <w:r>
+        <w:rPr>
+          <w:rFonts w:ascii="Arial" w:hAnsi="Arial" w:cs="Arial"/>
+          <w:lang w:val="es-MX"/>
+        </w:rPr>
+        <w:t>id_reserva</w:t>
+      </w:r>
+      <w:proofErr w:type="spellEnd"/>
+      <w:r>
+        <w:rPr>
+          <w:rFonts w:ascii="Arial" w:hAnsi="Arial" w:cs="Arial"/>
+          <w:lang w:val="es-MX"/>
+        </w:rPr>
+        <w:t xml:space="preserve"> para hacer el </w:t>
+      </w:r>
+      <w:proofErr w:type="spellStart"/>
+      <w:r>
+        <w:rPr>
+          <w:rFonts w:ascii="Arial" w:hAnsi="Arial" w:cs="Arial"/>
+          <w:lang w:val="es-MX"/>
+        </w:rPr>
+        <w:t>count</w:t>
+      </w:r>
+      <w:proofErr w:type="spellEnd"/>
+      <w:r>
+        <w:rPr>
+          <w:rFonts w:ascii="Arial" w:hAnsi="Arial" w:cs="Arial"/>
+          <w:lang w:val="es-MX"/>
+        </w:rPr>
+        <w:t>.</w:t>
       </w:r>
     </w:p>
     <w:p>
@@ -10500,6 +11609,7 @@
           <w:lang w:val="es-MX"/>
         </w:rPr>
       </w:pPr>
+      <w:proofErr w:type="spellStart"/>
       <w:r>
         <w:rPr>
           <w:rFonts w:ascii="Arial" w:hAnsi="Arial" w:cs="Arial"/>
@@ -10509,6 +11619,16 @@
         </w:rPr>
         <w:t>Vista_clientes_membresias</w:t>
       </w:r>
+      <w:r>
+        <w:rPr>
+          <w:rFonts w:ascii="Arial" w:hAnsi="Arial" w:cs="Arial"/>
+          <w:b/>
+          <w:bCs/>
+          <w:lang w:val="es-MX"/>
+        </w:rPr>
+        <w:t>_activas</w:t>
+      </w:r>
+      <w:proofErr w:type="spellEnd"/>
     </w:p>
     <w:p>
       <w:pPr>
@@ -10523,14 +11643,28 @@
           <w:rFonts w:ascii="Arial" w:hAnsi="Arial" w:cs="Arial"/>
           <w:lang w:val="es-MX"/>
         </w:rPr>
-        <w:t>El objetivo es ver qué membresía tiene cada cliente. Necesitamos las tablas clientes y membresías.</w:t>
-      </w:r>
-      <w:r>
-        <w:rPr>
-          <w:rFonts w:ascii="Arial" w:hAnsi="Arial" w:cs="Arial"/>
-          <w:lang w:val="es-MX"/>
-        </w:rPr>
-        <w:t xml:space="preserve"> Nos sirve para hacer un seguimiento de planes activos.</w:t>
+        <w:t xml:space="preserve">El objetivo es </w:t>
+      </w:r>
+      <w:r>
+        <w:rPr>
+          <w:rFonts w:ascii="Arial" w:hAnsi="Arial" w:cs="Arial"/>
+          <w:lang w:val="es-MX"/>
+        </w:rPr>
+        <w:t>para obtener rápidamente los clientes que tienen una membresía activa, junto con los datos más importante de su plan</w:t>
+      </w:r>
+      <w:r>
+        <w:rPr>
+          <w:rFonts w:ascii="Arial" w:hAnsi="Arial" w:cs="Arial"/>
+          <w:lang w:val="es-MX"/>
+        </w:rPr>
+        <w:t>.</w:t>
+      </w:r>
+      <w:r>
+        <w:rPr>
+          <w:rFonts w:ascii="Arial" w:hAnsi="Arial" w:cs="Arial"/>
+          <w:lang w:val="es-MX"/>
+        </w:rPr>
+        <w:t xml:space="preserve"> </w:t>
       </w:r>
     </w:p>
     <w:p>
@@ -10546,14 +11680,182 @@
           <w:rFonts w:ascii="Arial" w:hAnsi="Arial" w:cs="Arial"/>
           <w:lang w:val="es-MX"/>
         </w:rPr>
-        <w:t>De la tabla clientes usamos las columnas id_cliente, nombre, apellido, y de la tabla membresías usamos las columnas nombre como nombre_membresia, precio, duración_dias y limite_clases.</w:t>
-      </w:r>
-      <w:r>
-        <w:rPr>
-          <w:rFonts w:ascii="Arial" w:hAnsi="Arial" w:cs="Arial"/>
-          <w:lang w:val="es-MX"/>
-        </w:rPr>
-        <w:t xml:space="preserve"> Hacemos un JOIN de las 2 tablas.</w:t>
+        <w:t>Con esta vista podemos ver qué clientes pueden reservar clases, controlar su acceso al box, generar una lista de clientes activos.</w:t>
+      </w:r>
+      <w:r>
+        <w:rPr>
+          <w:rFonts w:ascii="Arial" w:hAnsi="Arial" w:cs="Arial"/>
+          <w:lang w:val="es-MX"/>
+        </w:rPr>
+        <w:t xml:space="preserve"> </w:t>
+      </w:r>
+    </w:p>
+    <w:p>
+      <w:pPr>
+        <w:jc w:val="both"/>
+        <w:rPr>
+          <w:rFonts w:ascii="Arial" w:hAnsi="Arial" w:cs="Arial"/>
+          <w:lang w:val="es-MX"/>
+        </w:rPr>
+      </w:pPr>
+      <w:r>
+        <w:rPr>
+          <w:rFonts w:ascii="Arial" w:hAnsi="Arial" w:cs="Arial"/>
+          <w:lang w:val="es-MX"/>
+        </w:rPr>
+        <w:t xml:space="preserve">Necesitamos las tablas clientes y </w:t>
+      </w:r>
+      <w:proofErr w:type="spellStart"/>
+      <w:r>
+        <w:rPr>
+          <w:rFonts w:ascii="Arial" w:hAnsi="Arial" w:cs="Arial"/>
+          <w:lang w:val="es-MX"/>
+        </w:rPr>
+        <w:t>planes_</w:t>
+      </w:r>
+      <w:r>
+        <w:rPr>
+          <w:rFonts w:ascii="Arial" w:hAnsi="Arial" w:cs="Arial"/>
+          <w:lang w:val="es-MX"/>
+        </w:rPr>
+        <w:t>membresía</w:t>
+      </w:r>
+      <w:proofErr w:type="spellEnd"/>
+      <w:r>
+        <w:rPr>
+          <w:rFonts w:ascii="Arial" w:hAnsi="Arial" w:cs="Arial"/>
+          <w:lang w:val="es-MX"/>
+        </w:rPr>
+        <w:t>.</w:t>
+      </w:r>
+      <w:r>
+        <w:rPr>
+          <w:rFonts w:ascii="Arial" w:hAnsi="Arial" w:cs="Arial"/>
+          <w:lang w:val="es-MX"/>
+        </w:rPr>
+        <w:t xml:space="preserve"> Nos sirve para hacer un seguimiento de planes activos.</w:t>
+      </w:r>
+    </w:p>
+    <w:p>
+      <w:pPr>
+        <w:jc w:val="both"/>
+        <w:rPr>
+          <w:rFonts w:ascii="Arial" w:hAnsi="Arial" w:cs="Arial"/>
+          <w:lang w:val="es-MX"/>
+        </w:rPr>
+      </w:pPr>
+      <w:r>
+        <w:rPr>
+          <w:rFonts w:ascii="Arial" w:hAnsi="Arial" w:cs="Arial"/>
+          <w:lang w:val="es-MX"/>
+        </w:rPr>
+        <w:t xml:space="preserve">De la tabla clientes usamos las columnas </w:t>
+      </w:r>
+      <w:proofErr w:type="spellStart"/>
+      <w:r>
+        <w:rPr>
+          <w:rFonts w:ascii="Arial" w:hAnsi="Arial" w:cs="Arial"/>
+          <w:lang w:val="es-MX"/>
+        </w:rPr>
+        <w:t>id_cliente</w:t>
+      </w:r>
+      <w:proofErr w:type="spellEnd"/>
+      <w:r>
+        <w:rPr>
+          <w:rFonts w:ascii="Arial" w:hAnsi="Arial" w:cs="Arial"/>
+          <w:lang w:val="es-MX"/>
+        </w:rPr>
+        <w:t>, nombre, apellido,</w:t>
+      </w:r>
+      <w:r>
+        <w:rPr>
+          <w:rFonts w:ascii="Arial" w:hAnsi="Arial" w:cs="Arial"/>
+          <w:lang w:val="es-MX"/>
+        </w:rPr>
+        <w:t xml:space="preserve"> d</w:t>
+      </w:r>
+      <w:r>
+        <w:rPr>
+          <w:rFonts w:ascii="Arial" w:hAnsi="Arial" w:cs="Arial"/>
+          <w:lang w:val="es-MX"/>
+        </w:rPr>
+        <w:t xml:space="preserve">e la tabla </w:t>
+      </w:r>
+      <w:proofErr w:type="spellStart"/>
+      <w:r>
+        <w:rPr>
+          <w:rFonts w:ascii="Arial" w:hAnsi="Arial" w:cs="Arial"/>
+          <w:lang w:val="es-MX"/>
+        </w:rPr>
+        <w:t>planes_membresi</w:t>
+      </w:r>
+      <w:r>
+        <w:rPr>
+          <w:rFonts w:ascii="Arial" w:hAnsi="Arial" w:cs="Arial"/>
+          <w:lang w:val="es-MX"/>
+        </w:rPr>
+        <w:t>a</w:t>
+      </w:r>
+      <w:proofErr w:type="spellEnd"/>
+      <w:r>
+        <w:rPr>
+          <w:rFonts w:ascii="Arial" w:hAnsi="Arial" w:cs="Arial"/>
+          <w:lang w:val="es-MX"/>
+        </w:rPr>
+        <w:t xml:space="preserve"> usamos las columnas nombre como </w:t>
+      </w:r>
+      <w:proofErr w:type="spellStart"/>
+      <w:r>
+        <w:rPr>
+          <w:rFonts w:ascii="Arial" w:hAnsi="Arial" w:cs="Arial"/>
+          <w:lang w:val="es-MX"/>
+        </w:rPr>
+        <w:t>nombre_membresia</w:t>
+      </w:r>
+      <w:proofErr w:type="spellEnd"/>
+      <w:r>
+        <w:rPr>
+          <w:rFonts w:ascii="Arial" w:hAnsi="Arial" w:cs="Arial"/>
+          <w:lang w:val="es-MX"/>
+        </w:rPr>
+        <w:t>, precio.</w:t>
+      </w:r>
+      <w:r>
+        <w:rPr>
+          <w:rFonts w:ascii="Arial" w:hAnsi="Arial" w:cs="Arial"/>
+          <w:lang w:val="es-MX"/>
+        </w:rPr>
+        <w:t xml:space="preserve"> </w:t>
+      </w:r>
+      <w:r>
+        <w:rPr>
+          <w:rFonts w:ascii="Arial" w:hAnsi="Arial" w:cs="Arial"/>
+          <w:lang w:val="es-MX"/>
+        </w:rPr>
+        <w:t>Hacemos un JOIN de las 2 tablas</w:t>
+      </w:r>
+      <w:r>
+        <w:rPr>
+          <w:rFonts w:ascii="Arial" w:hAnsi="Arial" w:cs="Arial"/>
+          <w:lang w:val="es-MX"/>
+        </w:rPr>
+        <w:t xml:space="preserve"> usando el </w:t>
+      </w:r>
+      <w:proofErr w:type="spellStart"/>
+      <w:r>
+        <w:rPr>
+          <w:rFonts w:ascii="Arial" w:hAnsi="Arial" w:cs="Arial"/>
+          <w:lang w:val="es-MX"/>
+        </w:rPr>
+        <w:t>id_cliente</w:t>
+      </w:r>
+      <w:proofErr w:type="spellEnd"/>
+      <w:r>
+        <w:rPr>
+          <w:rFonts w:ascii="Arial" w:hAnsi="Arial" w:cs="Arial"/>
+          <w:lang w:val="es-MX"/>
+        </w:rPr>
+        <w:t>, une clientes con sus membresías</w:t>
       </w:r>
     </w:p>
     <w:p>
@@ -10571,6 +11873,7 @@
           <w:lang w:val="es-MX"/>
         </w:rPr>
       </w:pPr>
+      <w:proofErr w:type="spellStart"/>
       <w:r>
         <w:rPr>
           <w:rFonts w:ascii="Arial" w:hAnsi="Arial" w:cs="Arial"/>
@@ -10580,6 +11883,7 @@
         </w:rPr>
         <w:t>Vista_pagos_clientes</w:t>
       </w:r>
+      <w:proofErr w:type="spellEnd"/>
     </w:p>
     <w:p>
       <w:pPr>
@@ -10626,7 +11930,55 @@
           <w:rFonts w:ascii="Arial" w:hAnsi="Arial" w:cs="Arial"/>
           <w:lang w:val="es-MX"/>
         </w:rPr>
-        <w:t>De la tabla pagos usamos las columnas id_pago, fecha_pago, método_pago.</w:t>
+        <w:t xml:space="preserve">De la tabla pagos usamos las columnas </w:t>
+      </w:r>
+      <w:proofErr w:type="spellStart"/>
+      <w:r>
+        <w:rPr>
+          <w:rFonts w:ascii="Arial" w:hAnsi="Arial" w:cs="Arial"/>
+          <w:lang w:val="es-MX"/>
+        </w:rPr>
+        <w:t>id_pago</w:t>
+      </w:r>
+      <w:proofErr w:type="spellEnd"/>
+      <w:r>
+        <w:rPr>
+          <w:rFonts w:ascii="Arial" w:hAnsi="Arial" w:cs="Arial"/>
+          <w:lang w:val="es-MX"/>
+        </w:rPr>
+        <w:t xml:space="preserve">, </w:t>
+      </w:r>
+      <w:proofErr w:type="spellStart"/>
+      <w:r>
+        <w:rPr>
+          <w:rFonts w:ascii="Arial" w:hAnsi="Arial" w:cs="Arial"/>
+          <w:lang w:val="es-MX"/>
+        </w:rPr>
+        <w:t>fecha_pago</w:t>
+      </w:r>
+      <w:proofErr w:type="spellEnd"/>
+      <w:r>
+        <w:rPr>
+          <w:rFonts w:ascii="Arial" w:hAnsi="Arial" w:cs="Arial"/>
+          <w:lang w:val="es-MX"/>
+        </w:rPr>
+        <w:t xml:space="preserve">, </w:t>
+      </w:r>
+      <w:proofErr w:type="spellStart"/>
+      <w:r>
+        <w:rPr>
+          <w:rFonts w:ascii="Arial" w:hAnsi="Arial" w:cs="Arial"/>
+          <w:lang w:val="es-MX"/>
+        </w:rPr>
+        <w:t>método_pago</w:t>
+      </w:r>
+      <w:proofErr w:type="spellEnd"/>
+      <w:r>
+        <w:rPr>
+          <w:rFonts w:ascii="Arial" w:hAnsi="Arial" w:cs="Arial"/>
+          <w:lang w:val="es-MX"/>
+        </w:rPr>
+        <w:t>.</w:t>
       </w:r>
     </w:p>
     <w:p>
@@ -10649,7 +12001,23 @@
           <w:rFonts w:ascii="Arial" w:hAnsi="Arial" w:cs="Arial"/>
           <w:lang w:val="es-MX"/>
         </w:rPr>
-        <w:t>nombre como nombre_membresia, y la columna precio.</w:t>
+        <w:t xml:space="preserve">nombre como </w:t>
+      </w:r>
+      <w:proofErr w:type="spellStart"/>
+      <w:r>
+        <w:rPr>
+          <w:rFonts w:ascii="Arial" w:hAnsi="Arial" w:cs="Arial"/>
+          <w:lang w:val="es-MX"/>
+        </w:rPr>
+        <w:t>nombre_membresia</w:t>
+      </w:r>
+      <w:proofErr w:type="spellEnd"/>
+      <w:r>
+        <w:rPr>
+          <w:rFonts w:ascii="Arial" w:hAnsi="Arial" w:cs="Arial"/>
+          <w:lang w:val="es-MX"/>
+        </w:rPr>
+        <w:t>, y la columna precio.</w:t>
       </w:r>
     </w:p>
     <w:p>
@@ -10721,7 +12089,23 @@
           <w:rFonts w:ascii="Arial" w:hAnsi="Arial" w:cs="Arial"/>
           <w:lang w:val="es-MX"/>
         </w:rPr>
-        <w:t>Calcula la edad en años a partir de fecha_nacimiento.</w:t>
+        <w:t xml:space="preserve">Calcula la edad en años a partir de </w:t>
+      </w:r>
+      <w:proofErr w:type="spellStart"/>
+      <w:r>
+        <w:rPr>
+          <w:rFonts w:ascii="Arial" w:hAnsi="Arial" w:cs="Arial"/>
+          <w:lang w:val="es-MX"/>
+        </w:rPr>
+        <w:t>fecha_nacimiento</w:t>
+      </w:r>
+      <w:proofErr w:type="spellEnd"/>
+      <w:r>
+        <w:rPr>
+          <w:rFonts w:ascii="Arial" w:hAnsi="Arial" w:cs="Arial"/>
+          <w:lang w:val="es-MX"/>
+        </w:rPr>
+        <w:t>.</w:t>
       </w:r>
     </w:p>
     <w:p>
@@ -10786,13 +12170,36 @@
           <w:lang w:val="es-MX"/>
         </w:rPr>
       </w:pPr>
-      <w:r>
+    </w:p>
+    <w:p>
+      <w:pPr>
+        <w:jc w:val="both"/>
         <w:rPr>
           <w:rFonts w:ascii="Arial" w:hAnsi="Arial" w:cs="Arial"/>
           <w:b/>
           <w:bCs/>
           <w:lang w:val="es-MX"/>
         </w:rPr>
+      </w:pPr>
+    </w:p>
+    <w:p>
+      <w:pPr>
+        <w:jc w:val="both"/>
+        <w:rPr>
+          <w:rFonts w:ascii="Arial" w:hAnsi="Arial" w:cs="Arial"/>
+          <w:b/>
+          <w:bCs/>
+          <w:lang w:val="es-MX"/>
+        </w:rPr>
+      </w:pPr>
+      <w:r>
+        <w:rPr>
+          <w:rFonts w:ascii="Arial" w:hAnsi="Arial" w:cs="Arial"/>
+          <w:b/>
+          <w:bCs/>
+          <w:lang w:val="es-MX"/>
+        </w:rPr>
+        <w:lastRenderedPageBreak/>
         <w:t>TRIGGERS</w:t>
       </w:r>
     </w:p>
@@ -10848,15 +12255,7 @@
           <w:rFonts w:ascii="Arial" w:hAnsi="Arial" w:cs="Arial"/>
           <w:lang w:val="es-MX"/>
         </w:rPr>
-        <w:t xml:space="preserve"> no nos deje hacerlo si el cupo de esa </w:t>
-      </w:r>
-      <w:r>
-        <w:rPr>
-          <w:rFonts w:ascii="Arial" w:hAnsi="Arial" w:cs="Arial"/>
-          <w:lang w:val="es-MX"/>
-        </w:rPr>
-        <w:lastRenderedPageBreak/>
-        <w:t>clase está lleno.</w:t>
+        <w:t xml:space="preserve"> no nos deje hacerlo si el cupo de esa clase está lleno.</w:t>
       </w:r>
       <w:r>
         <w:rPr>
@@ -10879,7 +12278,23 @@
           <w:rFonts w:ascii="Arial" w:hAnsi="Arial" w:cs="Arial"/>
           <w:lang w:val="es-MX"/>
         </w:rPr>
-        <w:t>Si el trigger falla, la reserva no se guarda.</w:t>
+        <w:t xml:space="preserve">Si el </w:t>
+      </w:r>
+      <w:proofErr w:type="spellStart"/>
+      <w:r>
+        <w:rPr>
+          <w:rFonts w:ascii="Arial" w:hAnsi="Arial" w:cs="Arial"/>
+          <w:lang w:val="es-MX"/>
+        </w:rPr>
+        <w:t>trigger</w:t>
+      </w:r>
+      <w:proofErr w:type="spellEnd"/>
+      <w:r>
+        <w:rPr>
+          <w:rFonts w:ascii="Arial" w:hAnsi="Arial" w:cs="Arial"/>
+          <w:lang w:val="es-MX"/>
+        </w:rPr>
+        <w:t xml:space="preserve"> falla, la reserva no se guarda.</w:t>
       </w:r>
     </w:p>
     <w:p>
@@ -10895,7 +12310,23 @@
           <w:rFonts w:ascii="Arial" w:hAnsi="Arial" w:cs="Arial"/>
           <w:lang w:val="es-MX"/>
         </w:rPr>
-        <w:t>Este trigger nos garantiza la integridad del negocio porque evita que se registren más reservas que el cupo permitido</w:t>
+        <w:t xml:space="preserve">Este </w:t>
+      </w:r>
+      <w:proofErr w:type="spellStart"/>
+      <w:r>
+        <w:rPr>
+          <w:rFonts w:ascii="Arial" w:hAnsi="Arial" w:cs="Arial"/>
+          <w:lang w:val="es-MX"/>
+        </w:rPr>
+        <w:t>trigger</w:t>
+      </w:r>
+      <w:proofErr w:type="spellEnd"/>
+      <w:r>
+        <w:rPr>
+          <w:rFonts w:ascii="Arial" w:hAnsi="Arial" w:cs="Arial"/>
+          <w:lang w:val="es-MX"/>
+        </w:rPr>
+        <w:t xml:space="preserve"> nos garantiza la integridad del negocio porque evita que se registren más reservas que el cupo permitido</w:t>
       </w:r>
       <w:r>
         <w:rPr>
@@ -10943,7 +12374,23 @@
           <w:rFonts w:ascii="Arial" w:hAnsi="Arial" w:cs="Arial"/>
           <w:lang w:val="es-MX"/>
         </w:rPr>
-        <w:t>El objetivo de este trigger es cambiar el estado del cliente a Activo cuando realice un pago. Usamos la tabla pagos. Es de tipo AFTER INSERT porque una vez que el cliente realice el pago (se inserte un dato en la tabla pagos), recién cambia su estado de inactivo a activo.</w:t>
+        <w:t xml:space="preserve">El objetivo de este </w:t>
+      </w:r>
+      <w:proofErr w:type="spellStart"/>
+      <w:r>
+        <w:rPr>
+          <w:rFonts w:ascii="Arial" w:hAnsi="Arial" w:cs="Arial"/>
+          <w:lang w:val="es-MX"/>
+        </w:rPr>
+        <w:t>trigger</w:t>
+      </w:r>
+      <w:proofErr w:type="spellEnd"/>
+      <w:r>
+        <w:rPr>
+          <w:rFonts w:ascii="Arial" w:hAnsi="Arial" w:cs="Arial"/>
+          <w:lang w:val="es-MX"/>
+        </w:rPr>
+        <w:t xml:space="preserve"> es cambiar el estado del cliente a Activo cuando realice un pago. Usamos la tabla pagos. Es de tipo AFTER INSERT porque una vez que el cliente realice el pago (se inserte un dato en la tabla pagos), recién cambia su estado de inactivo a activo.</w:t>
       </w:r>
       <w:r>
         <w:rPr>
@@ -11029,7 +12476,39 @@
           <w:rFonts w:ascii="Arial" w:hAnsi="Arial" w:cs="Arial"/>
           <w:lang w:val="es-MX"/>
         </w:rPr>
-        <w:t>El objetivo de este stored procedure es registrar una reserva sólo si el cliente está activo y si la clase existe.</w:t>
+        <w:t xml:space="preserve">El objetivo de este </w:t>
+      </w:r>
+      <w:proofErr w:type="spellStart"/>
+      <w:r>
+        <w:rPr>
+          <w:rFonts w:ascii="Arial" w:hAnsi="Arial" w:cs="Arial"/>
+          <w:lang w:val="es-MX"/>
+        </w:rPr>
+        <w:t>stored</w:t>
+      </w:r>
+      <w:proofErr w:type="spellEnd"/>
+      <w:r>
+        <w:rPr>
+          <w:rFonts w:ascii="Arial" w:hAnsi="Arial" w:cs="Arial"/>
+          <w:lang w:val="es-MX"/>
+        </w:rPr>
+        <w:t xml:space="preserve"> </w:t>
+      </w:r>
+      <w:proofErr w:type="spellStart"/>
+      <w:r>
+        <w:rPr>
+          <w:rFonts w:ascii="Arial" w:hAnsi="Arial" w:cs="Arial"/>
+          <w:lang w:val="es-MX"/>
+        </w:rPr>
+        <w:t>procedure</w:t>
+      </w:r>
+      <w:proofErr w:type="spellEnd"/>
+      <w:r>
+        <w:rPr>
+          <w:rFonts w:ascii="Arial" w:hAnsi="Arial" w:cs="Arial"/>
+          <w:lang w:val="es-MX"/>
+        </w:rPr>
+        <w:t xml:space="preserve"> es registrar una reserva sólo si el cliente está activo y si la clase existe.</w:t>
       </w:r>
     </w:p>
     <w:p>
@@ -11045,7 +12524,23 @@
           <w:rFonts w:ascii="Arial" w:hAnsi="Arial" w:cs="Arial"/>
           <w:lang w:val="es-MX"/>
         </w:rPr>
-        <w:t>El control de cupo ya lo hace el trigger, así que aquí no se repite. Se evita que clientes inactivos se inscriban a las clases, y asegura que la clase a la que se inscriba exista.</w:t>
+        <w:t xml:space="preserve">El control de cupo ya lo hace el </w:t>
+      </w:r>
+      <w:proofErr w:type="spellStart"/>
+      <w:r>
+        <w:rPr>
+          <w:rFonts w:ascii="Arial" w:hAnsi="Arial" w:cs="Arial"/>
+          <w:lang w:val="es-MX"/>
+        </w:rPr>
+        <w:t>trigger</w:t>
+      </w:r>
+      <w:proofErr w:type="spellEnd"/>
+      <w:r>
+        <w:rPr>
+          <w:rFonts w:ascii="Arial" w:hAnsi="Arial" w:cs="Arial"/>
+          <w:lang w:val="es-MX"/>
+        </w:rPr>
+        <w:t>, así que aquí no se repite. Se evita que clientes inactivos se inscriban a las clases, y asegura que la clase a la que se inscriba exista.</w:t>
       </w:r>
     </w:p>
     <w:p>
@@ -11086,7 +12581,23 @@
           <w:rFonts w:ascii="Arial" w:hAnsi="Arial" w:cs="Arial"/>
           <w:lang w:val="es-MX"/>
         </w:rPr>
-        <w:t>El objetivo es registrar un pago y activar automáticamente al cliente reforzando así el trigger.</w:t>
+        <w:t xml:space="preserve">El objetivo es registrar un pago y activar automáticamente al cliente reforzando así el </w:t>
+      </w:r>
+      <w:proofErr w:type="spellStart"/>
+      <w:r>
+        <w:rPr>
+          <w:rFonts w:ascii="Arial" w:hAnsi="Arial" w:cs="Arial"/>
+          <w:lang w:val="es-MX"/>
+        </w:rPr>
+        <w:t>trigger</w:t>
+      </w:r>
+      <w:proofErr w:type="spellEnd"/>
+      <w:r>
+        <w:rPr>
+          <w:rFonts w:ascii="Arial" w:hAnsi="Arial" w:cs="Arial"/>
+          <w:lang w:val="es-MX"/>
+        </w:rPr>
+        <w:t>.</w:t>
       </w:r>
     </w:p>
     <w:p>
@@ -11102,7 +12613,39 @@
           <w:rFonts w:ascii="Arial" w:hAnsi="Arial" w:cs="Arial"/>
           <w:lang w:val="es-AR"/>
         </w:rPr>
-        <w:t>El trigger AFTER ISERT ON pagos era el que se encargaba de activar al cliente. Aquí se registra el pago, inserta el pago y así dispara el trigger que activa automáticamente al cliente una vez que ya se realizó el pago.</w:t>
+        <w:t xml:space="preserve">El </w:t>
+      </w:r>
+      <w:proofErr w:type="spellStart"/>
+      <w:r>
+        <w:rPr>
+          <w:rFonts w:ascii="Arial" w:hAnsi="Arial" w:cs="Arial"/>
+          <w:lang w:val="es-AR"/>
+        </w:rPr>
+        <w:t>trigger</w:t>
+      </w:r>
+      <w:proofErr w:type="spellEnd"/>
+      <w:r>
+        <w:rPr>
+          <w:rFonts w:ascii="Arial" w:hAnsi="Arial" w:cs="Arial"/>
+          <w:lang w:val="es-AR"/>
+        </w:rPr>
+        <w:t xml:space="preserve"> AFTER ISERT ON pagos era el que se encargaba de activar al cliente. Aquí se registra el pago, inserta el pago y así dispara el </w:t>
+      </w:r>
+      <w:proofErr w:type="spellStart"/>
+      <w:r>
+        <w:rPr>
+          <w:rFonts w:ascii="Arial" w:hAnsi="Arial" w:cs="Arial"/>
+          <w:lang w:val="es-AR"/>
+        </w:rPr>
+        <w:t>trigger</w:t>
+      </w:r>
+      <w:proofErr w:type="spellEnd"/>
+      <w:r>
+        <w:rPr>
+          <w:rFonts w:ascii="Arial" w:hAnsi="Arial" w:cs="Arial"/>
+          <w:lang w:val="es-AR"/>
+        </w:rPr>
+        <w:t xml:space="preserve"> que activa automáticamente al cliente una vez que ya se realizó el pago.</w:t>
       </w:r>
     </w:p>
     <w:p>
@@ -11129,24 +12672,52 @@
       </w:r>
     </w:p>
     <w:p>
-      <w:pPr>
-        <w:rPr>
-          <w:rFonts w:ascii="Arial" w:hAnsi="Arial" w:cs="Arial"/>
-        </w:rPr>
-      </w:pPr>
       <w:hyperlink r:id="rId8" w:history="1">
+        <w:proofErr w:type="spellStart"/>
         <w:r>
           <w:rPr>
             <w:rStyle w:val="Hipervnculo"/>
           </w:rPr>
-          <w:t>CH_MySQL/entregable_n2 at main · EmiTorres7/CH_MySQL</w:t>
+          <w:t>CH_MySQL</w:t>
         </w:r>
+        <w:proofErr w:type="spellEnd"/>
+        <w:r>
+          <w:rPr>
+            <w:rStyle w:val="Hipervnculo"/>
+          </w:rPr>
+          <w:t>/</w:t>
+        </w:r>
+        <w:proofErr w:type="spellStart"/>
+        <w:r>
+          <w:rPr>
+            <w:rStyle w:val="Hipervnculo"/>
+          </w:rPr>
+          <w:t>proyecto_final</w:t>
+        </w:r>
+        <w:proofErr w:type="spellEnd"/>
+        <w:r>
+          <w:rPr>
+            <w:rStyle w:val="Hipervnculo"/>
+          </w:rPr>
+          <w:t xml:space="preserve"> at main · EmiTorres7/</w:t>
+        </w:r>
+        <w:proofErr w:type="spellStart"/>
+        <w:r>
+          <w:rPr>
+            <w:rStyle w:val="Hipervnculo"/>
+          </w:rPr>
+          <w:t>CH_MySQL</w:t>
+        </w:r>
+        <w:proofErr w:type="spellEnd"/>
       </w:hyperlink>
     </w:p>
+    <w:p/>
     <w:p>
       <w:pPr>
         <w:rPr>
           <w:rFonts w:ascii="Arial" w:hAnsi="Arial" w:cs="Arial"/>
+          <w:b/>
+          <w:bCs/>
         </w:rPr>
       </w:pPr>
     </w:p>
@@ -11154,6 +12725,843 @@
       <w:pPr>
         <w:rPr>
           <w:rFonts w:ascii="Arial" w:hAnsi="Arial" w:cs="Arial"/>
+          <w:b/>
+          <w:bCs/>
+          <w:lang w:val="es-AR"/>
+        </w:rPr>
+      </w:pPr>
+      <w:r>
+        <w:rPr>
+          <w:rFonts w:ascii="Arial" w:hAnsi="Arial" w:cs="Arial"/>
+          <w:b/>
+          <w:bCs/>
+          <w:lang w:val="es-AR"/>
+        </w:rPr>
+        <w:lastRenderedPageBreak/>
+        <w:t>INFORME</w:t>
+      </w:r>
+    </w:p>
+    <w:p>
+      <w:pPr>
+        <w:rPr>
+          <w:rFonts w:ascii="Arial" w:hAnsi="Arial" w:cs="Arial"/>
+          <w:lang w:val="es-AR"/>
+        </w:rPr>
+      </w:pPr>
+      <w:r>
+        <w:rPr>
+          <w:rFonts w:ascii="Arial" w:hAnsi="Arial" w:cs="Arial"/>
+          <w:lang w:val="es-AR"/>
+        </w:rPr>
+        <w:t>El informe resume i</w:t>
+      </w:r>
+      <w:r>
+        <w:rPr>
+          <w:rFonts w:ascii="Arial" w:hAnsi="Arial" w:cs="Arial"/>
+          <w:lang w:val="es-AR"/>
+        </w:rPr>
+        <w:t>ndicadores clave</w:t>
+      </w:r>
+      <w:r>
+        <w:rPr>
+          <w:rFonts w:ascii="Arial" w:hAnsi="Arial" w:cs="Arial"/>
+          <w:lang w:val="es-AR"/>
+        </w:rPr>
+        <w:t xml:space="preserve"> del box mediante gráficos de torta y barras, permitiendo analizar el estado de los clientes, la popularidad de los planes y los métodos de pago más utilizados.</w:t>
+      </w:r>
+    </w:p>
+    <w:p>
+      <w:pPr>
+        <w:rPr>
+          <w:rFonts w:ascii="Arial" w:hAnsi="Arial" w:cs="Arial"/>
+          <w:u w:val="single"/>
+          <w:lang w:val="es-AR"/>
+        </w:rPr>
+      </w:pPr>
+      <w:r>
+        <w:rPr>
+          <w:rFonts w:ascii="Arial" w:hAnsi="Arial" w:cs="Arial"/>
+          <w:u w:val="single"/>
+          <w:lang w:val="es-AR"/>
+        </w:rPr>
+        <w:t>Resumen general</w:t>
+      </w:r>
+    </w:p>
+    <w:p>
+      <w:pPr>
+        <w:rPr>
+          <w:rFonts w:ascii="Arial" w:hAnsi="Arial" w:cs="Arial"/>
+          <w:lang w:val="es-AR"/>
+        </w:rPr>
+      </w:pPr>
+      <w:r>
+        <w:rPr>
+          <w:rFonts w:ascii="Arial" w:hAnsi="Arial" w:cs="Arial"/>
+          <w:lang w:val="es-AR"/>
+        </w:rPr>
+        <w:t xml:space="preserve">Cumple el rol de un </w:t>
+      </w:r>
+      <w:proofErr w:type="spellStart"/>
+      <w:r>
+        <w:rPr>
+          <w:rFonts w:ascii="Arial" w:hAnsi="Arial" w:cs="Arial"/>
+          <w:lang w:val="es-AR"/>
+        </w:rPr>
+        <w:t>dahsboard</w:t>
+      </w:r>
+      <w:proofErr w:type="spellEnd"/>
+      <w:r>
+        <w:rPr>
+          <w:rFonts w:ascii="Arial" w:hAnsi="Arial" w:cs="Arial"/>
+          <w:lang w:val="es-AR"/>
+        </w:rPr>
+        <w:t xml:space="preserve"> inicial. Nos muestra:</w:t>
+      </w:r>
+    </w:p>
+    <w:p>
+      <w:pPr>
+        <w:pStyle w:val="Prrafodelista"/>
+        <w:numPr>
+          <w:ilvl w:val="0"/>
+          <w:numId w:val="6"/>
+        </w:numPr>
+        <w:rPr>
+          <w:rFonts w:ascii="Arial" w:hAnsi="Arial" w:cs="Arial"/>
+          <w:lang w:val="es-AR"/>
+        </w:rPr>
+      </w:pPr>
+      <w:r>
+        <w:rPr>
+          <w:rFonts w:ascii="Arial" w:hAnsi="Arial" w:cs="Arial"/>
+          <w:lang w:val="es-AR"/>
+        </w:rPr>
+        <w:t>Clientes activos</w:t>
+      </w:r>
+    </w:p>
+    <w:p>
+      <w:pPr>
+        <w:pStyle w:val="Prrafodelista"/>
+        <w:numPr>
+          <w:ilvl w:val="0"/>
+          <w:numId w:val="6"/>
+        </w:numPr>
+        <w:rPr>
+          <w:rFonts w:ascii="Arial" w:hAnsi="Arial" w:cs="Arial"/>
+          <w:lang w:val="es-AR"/>
+        </w:rPr>
+      </w:pPr>
+      <w:r>
+        <w:rPr>
+          <w:rFonts w:ascii="Arial" w:hAnsi="Arial" w:cs="Arial"/>
+          <w:lang w:val="es-AR"/>
+        </w:rPr>
+        <w:t>Clientes inactivos</w:t>
+      </w:r>
+    </w:p>
+    <w:p>
+      <w:pPr>
+        <w:pStyle w:val="Prrafodelista"/>
+        <w:numPr>
+          <w:ilvl w:val="0"/>
+          <w:numId w:val="6"/>
+        </w:numPr>
+        <w:rPr>
+          <w:rFonts w:ascii="Arial" w:hAnsi="Arial" w:cs="Arial"/>
+          <w:lang w:val="es-AR"/>
+        </w:rPr>
+      </w:pPr>
+      <w:r>
+        <w:rPr>
+          <w:rFonts w:ascii="Arial" w:hAnsi="Arial" w:cs="Arial"/>
+          <w:lang w:val="es-AR"/>
+        </w:rPr>
+        <w:t>Cantidad de planes disponibles</w:t>
+      </w:r>
+    </w:p>
+    <w:p>
+      <w:pPr>
+        <w:pStyle w:val="Prrafodelista"/>
+        <w:numPr>
+          <w:ilvl w:val="0"/>
+          <w:numId w:val="6"/>
+        </w:numPr>
+        <w:rPr>
+          <w:rFonts w:ascii="Arial" w:hAnsi="Arial" w:cs="Arial"/>
+          <w:lang w:val="es-AR"/>
+        </w:rPr>
+      </w:pPr>
+      <w:r>
+        <w:rPr>
+          <w:rFonts w:ascii="Arial" w:hAnsi="Arial" w:cs="Arial"/>
+          <w:lang w:val="es-AR"/>
+        </w:rPr>
+        <w:t>Pagos registrados</w:t>
+      </w:r>
+      <w:r>
+        <w:rPr>
+          <w:rFonts w:ascii="Arial" w:hAnsi="Arial" w:cs="Arial"/>
+          <w:lang w:val="es-AR"/>
+        </w:rPr>
+        <w:t xml:space="preserve"> </w:t>
+      </w:r>
+    </w:p>
+    <w:p>
+      <w:pPr>
+        <w:rPr>
+          <w:rFonts w:ascii="Arial" w:hAnsi="Arial" w:cs="Arial"/>
+          <w:lang w:val="es-AR"/>
+        </w:rPr>
+      </w:pPr>
+      <w:r>
+        <w:rPr>
+          <w:noProof/>
+        </w:rPr>
+        <w:drawing>
+          <wp:inline distT="0" distB="0" distL="0" distR="0" wp14:anchorId="1B7E2AA2" wp14:editId="7B946FB9">
+            <wp:extent cx="3727450" cy="1765634"/>
+            <wp:effectExtent l="0" t="0" r="6350" b="6350"/>
+            <wp:docPr id="35" name="Imagen 35"/>
+            <wp:cNvGraphicFramePr>
+              <a:graphicFrameLocks xmlns:a="http://schemas.openxmlformats.org/drawingml/2006/main" noChangeAspect="1"/>
+            </wp:cNvGraphicFramePr>
+            <a:graphic xmlns:a="http://schemas.openxmlformats.org/drawingml/2006/main">
+              <a:graphicData uri="http://schemas.openxmlformats.org/drawingml/2006/picture">
+                <pic:pic xmlns:pic="http://schemas.openxmlformats.org/drawingml/2006/picture">
+                  <pic:nvPicPr>
+                    <pic:cNvPr id="1" name=""/>
+                    <pic:cNvPicPr/>
+                  </pic:nvPicPr>
+                  <pic:blipFill rotWithShape="1">
+                    <a:blip r:embed="rId9"/>
+                    <a:srcRect l="2038" t="30791" r="56041" b="33890"/>
+                    <a:stretch/>
+                  </pic:blipFill>
+                  <pic:spPr bwMode="auto">
+                    <a:xfrm>
+                      <a:off x="0" y="0"/>
+                      <a:ext cx="3744959" cy="1773928"/>
+                    </a:xfrm>
+                    <a:prstGeom prst="rect">
+                      <a:avLst/>
+                    </a:prstGeom>
+                    <a:ln>
+                      <a:noFill/>
+                    </a:ln>
+                    <a:extLst>
+                      <a:ext uri="{53640926-AAD7-44D8-BBD7-CCE9431645EC}">
+                        <a14:shadowObscured xmlns:a14="http://schemas.microsoft.com/office/drawing/2010/main"/>
+                      </a:ext>
+                    </a:extLst>
+                  </pic:spPr>
+                </pic:pic>
+              </a:graphicData>
+            </a:graphic>
+          </wp:inline>
+        </w:drawing>
+      </w:r>
+    </w:p>
+    <w:p>
+      <w:pPr>
+        <w:rPr>
+          <w:rFonts w:ascii="Arial" w:hAnsi="Arial" w:cs="Arial"/>
+          <w:u w:val="single"/>
+          <w:lang w:val="es-AR"/>
+        </w:rPr>
+      </w:pPr>
+      <w:r>
+        <w:rPr>
+          <w:rFonts w:ascii="Arial" w:hAnsi="Arial" w:cs="Arial"/>
+          <w:u w:val="single"/>
+          <w:lang w:val="es-AR"/>
+        </w:rPr>
+        <w:t>Gráfico cliente por estado</w:t>
+      </w:r>
+    </w:p>
+    <w:p>
+      <w:pPr>
+        <w:rPr>
+          <w:rFonts w:ascii="Arial" w:hAnsi="Arial" w:cs="Arial"/>
+          <w:lang w:val="es-AR"/>
+        </w:rPr>
+      </w:pPr>
+      <w:r>
+        <w:rPr>
+          <w:rFonts w:ascii="Arial" w:hAnsi="Arial" w:cs="Arial"/>
+          <w:lang w:val="es-AR"/>
+        </w:rPr>
+        <w:t>Nos permite visualizar rápidamente la proporción de clientes habilitados. Nos muestra los clientes Activos y los Inactivos</w:t>
+      </w:r>
+    </w:p>
+    <w:p>
+      <w:pPr>
+        <w:rPr>
+          <w:rFonts w:ascii="Arial" w:hAnsi="Arial" w:cs="Arial"/>
+          <w:lang w:val="es-AR"/>
+        </w:rPr>
+      </w:pPr>
+      <w:r>
+        <w:rPr>
+          <w:noProof/>
+        </w:rPr>
+        <w:drawing>
+          <wp:inline distT="0" distB="0" distL="0" distR="0" wp14:anchorId="4ACE98D6" wp14:editId="51901CAD">
+            <wp:extent cx="4511842" cy="1905000"/>
+            <wp:effectExtent l="0" t="0" r="3175" b="0"/>
+            <wp:docPr id="36" name="Imagen 36"/>
+            <wp:cNvGraphicFramePr>
+              <a:graphicFrameLocks xmlns:a="http://schemas.openxmlformats.org/drawingml/2006/main" noChangeAspect="1"/>
+            </wp:cNvGraphicFramePr>
+            <a:graphic xmlns:a="http://schemas.openxmlformats.org/drawingml/2006/main">
+              <a:graphicData uri="http://schemas.openxmlformats.org/drawingml/2006/picture">
+                <pic:pic xmlns:pic="http://schemas.openxmlformats.org/drawingml/2006/picture">
+                  <pic:nvPicPr>
+                    <pic:cNvPr id="1" name=""/>
+                    <pic:cNvPicPr/>
+                  </pic:nvPicPr>
+                  <pic:blipFill rotWithShape="1">
+                    <a:blip r:embed="rId10"/>
+                    <a:srcRect l="1696" t="30489" r="60116" b="40833"/>
+                    <a:stretch/>
+                  </pic:blipFill>
+                  <pic:spPr bwMode="auto">
+                    <a:xfrm>
+                      <a:off x="0" y="0"/>
+                      <a:ext cx="4523263" cy="1909822"/>
+                    </a:xfrm>
+                    <a:prstGeom prst="rect">
+                      <a:avLst/>
+                    </a:prstGeom>
+                    <a:ln>
+                      <a:noFill/>
+                    </a:ln>
+                    <a:extLst>
+                      <a:ext uri="{53640926-AAD7-44D8-BBD7-CCE9431645EC}">
+                        <a14:shadowObscured xmlns:a14="http://schemas.microsoft.com/office/drawing/2010/main"/>
+                      </a:ext>
+                    </a:extLst>
+                  </pic:spPr>
+                </pic:pic>
+              </a:graphicData>
+            </a:graphic>
+          </wp:inline>
+        </w:drawing>
+      </w:r>
+    </w:p>
+    <w:p>
+      <w:pPr>
+        <w:rPr>
+          <w:rFonts w:ascii="Arial" w:hAnsi="Arial" w:cs="Arial"/>
+          <w:u w:val="single"/>
+          <w:lang w:val="es-AR"/>
+        </w:rPr>
+      </w:pPr>
+    </w:p>
+    <w:p>
+      <w:pPr>
+        <w:rPr>
+          <w:rFonts w:ascii="Arial" w:hAnsi="Arial" w:cs="Arial"/>
+          <w:u w:val="single"/>
+          <w:lang w:val="es-AR"/>
+        </w:rPr>
+      </w:pPr>
+    </w:p>
+    <w:p>
+      <w:pPr>
+        <w:rPr>
+          <w:rFonts w:ascii="Arial" w:hAnsi="Arial" w:cs="Arial"/>
+          <w:u w:val="single"/>
+          <w:lang w:val="es-AR"/>
+        </w:rPr>
+      </w:pPr>
+    </w:p>
+    <w:p>
+      <w:pPr>
+        <w:rPr>
+          <w:rFonts w:ascii="Arial" w:hAnsi="Arial" w:cs="Arial"/>
+          <w:u w:val="single"/>
+          <w:lang w:val="es-AR"/>
+        </w:rPr>
+      </w:pPr>
+    </w:p>
+    <w:p>
+      <w:pPr>
+        <w:rPr>
+          <w:rFonts w:ascii="Arial" w:hAnsi="Arial" w:cs="Arial"/>
+          <w:u w:val="single"/>
+          <w:lang w:val="es-AR"/>
+        </w:rPr>
+      </w:pPr>
+    </w:p>
+    <w:p>
+      <w:pPr>
+        <w:rPr>
+          <w:rFonts w:ascii="Arial" w:hAnsi="Arial" w:cs="Arial"/>
+          <w:u w:val="single"/>
+          <w:lang w:val="es-AR"/>
+        </w:rPr>
+      </w:pPr>
+      <w:r>
+        <w:rPr>
+          <w:rFonts w:ascii="Arial" w:hAnsi="Arial" w:cs="Arial"/>
+          <w:u w:val="single"/>
+          <w:lang w:val="es-AR"/>
+        </w:rPr>
+        <w:lastRenderedPageBreak/>
+        <w:t>Gráfico planes de Membresías más usadas</w:t>
+      </w:r>
+    </w:p>
+    <w:p>
+      <w:pPr>
+        <w:rPr>
+          <w:rFonts w:ascii="Arial" w:hAnsi="Arial" w:cs="Arial"/>
+          <w:lang w:val="es-AR"/>
+        </w:rPr>
+      </w:pPr>
+      <w:r>
+        <w:rPr>
+          <w:rFonts w:ascii="Arial" w:hAnsi="Arial" w:cs="Arial"/>
+          <w:lang w:val="es-AR"/>
+        </w:rPr>
+        <w:t>Nos muestra cuáles son los planes más elegidos. Nos muestra los tipos de planes.</w:t>
+      </w:r>
+    </w:p>
+    <w:p>
+      <w:pPr>
+        <w:rPr>
+          <w:rFonts w:ascii="Arial" w:hAnsi="Arial" w:cs="Arial"/>
+          <w:lang w:val="es-AR"/>
+        </w:rPr>
+      </w:pPr>
+      <w:r>
+        <w:rPr>
+          <w:noProof/>
+        </w:rPr>
+        <w:drawing>
+          <wp:inline distT="0" distB="0" distL="0" distR="0" wp14:anchorId="3A3C3FB7" wp14:editId="70577C70">
+            <wp:extent cx="4618879" cy="1914788"/>
+            <wp:effectExtent l="0" t="0" r="0" b="9525"/>
+            <wp:docPr id="37" name="Imagen 37"/>
+            <wp:cNvGraphicFramePr>
+              <a:graphicFrameLocks xmlns:a="http://schemas.openxmlformats.org/drawingml/2006/main" noChangeAspect="1"/>
+            </wp:cNvGraphicFramePr>
+            <a:graphic xmlns:a="http://schemas.openxmlformats.org/drawingml/2006/main">
+              <a:graphicData uri="http://schemas.openxmlformats.org/drawingml/2006/picture">
+                <pic:pic xmlns:pic="http://schemas.openxmlformats.org/drawingml/2006/picture">
+                  <pic:nvPicPr>
+                    <pic:cNvPr id="1" name=""/>
+                    <pic:cNvPicPr/>
+                  </pic:nvPicPr>
+                  <pic:blipFill rotWithShape="1">
+                    <a:blip r:embed="rId11"/>
+                    <a:srcRect l="1697" t="31093" r="44671" b="29362"/>
+                    <a:stretch/>
+                  </pic:blipFill>
+                  <pic:spPr bwMode="auto">
+                    <a:xfrm>
+                      <a:off x="0" y="0"/>
+                      <a:ext cx="4637902" cy="1922674"/>
+                    </a:xfrm>
+                    <a:prstGeom prst="rect">
+                      <a:avLst/>
+                    </a:prstGeom>
+                    <a:ln>
+                      <a:noFill/>
+                    </a:ln>
+                    <a:extLst>
+                      <a:ext uri="{53640926-AAD7-44D8-BBD7-CCE9431645EC}">
+                        <a14:shadowObscured xmlns:a14="http://schemas.microsoft.com/office/drawing/2010/main"/>
+                      </a:ext>
+                    </a:extLst>
+                  </pic:spPr>
+                </pic:pic>
+              </a:graphicData>
+            </a:graphic>
+          </wp:inline>
+        </w:drawing>
+      </w:r>
+    </w:p>
+    <w:p>
+      <w:pPr>
+        <w:rPr>
+          <w:rFonts w:ascii="Arial" w:hAnsi="Arial" w:cs="Arial"/>
+          <w:u w:val="single"/>
+          <w:lang w:val="es-AR"/>
+        </w:rPr>
+      </w:pPr>
+      <w:r>
+        <w:rPr>
+          <w:rFonts w:ascii="Arial" w:hAnsi="Arial" w:cs="Arial"/>
+          <w:u w:val="single"/>
+          <w:lang w:val="es-AR"/>
+        </w:rPr>
+        <w:t>Gráfico de Métodos de pago</w:t>
+      </w:r>
+    </w:p>
+    <w:p>
+      <w:pPr>
+        <w:rPr>
+          <w:rFonts w:ascii="Arial" w:hAnsi="Arial" w:cs="Arial"/>
+          <w:lang w:val="es-AR"/>
+        </w:rPr>
+      </w:pPr>
+      <w:r>
+        <w:rPr>
+          <w:rFonts w:ascii="Arial" w:hAnsi="Arial" w:cs="Arial"/>
+          <w:lang w:val="es-AR"/>
+        </w:rPr>
+        <w:t xml:space="preserve">Esto nos informa </w:t>
+      </w:r>
+      <w:r>
+        <w:rPr>
+          <w:rFonts w:ascii="Arial" w:hAnsi="Arial" w:cs="Arial"/>
+          <w:lang w:val="es-AR"/>
+        </w:rPr>
+        <w:t xml:space="preserve">los principales métodos de pago </w:t>
+      </w:r>
+      <w:r>
+        <w:rPr>
+          <w:rFonts w:ascii="Arial" w:hAnsi="Arial" w:cs="Arial"/>
+          <w:lang w:val="es-AR"/>
+        </w:rPr>
+        <w:t>y las preferencias de pago del cliente.</w:t>
+      </w:r>
+    </w:p>
+    <w:p>
+      <w:pPr>
+        <w:rPr>
+          <w:rFonts w:ascii="Arial" w:hAnsi="Arial" w:cs="Arial"/>
+          <w:lang w:val="es-AR"/>
+        </w:rPr>
+      </w:pPr>
+      <w:r>
+        <w:rPr>
+          <w:noProof/>
+        </w:rPr>
+        <w:drawing>
+          <wp:inline distT="0" distB="0" distL="0" distR="0" wp14:anchorId="3A8697A8" wp14:editId="7799ACC6">
+            <wp:extent cx="4352925" cy="1775742"/>
+            <wp:effectExtent l="0" t="0" r="0" b="0"/>
+            <wp:docPr id="38" name="Imagen 38"/>
+            <wp:cNvGraphicFramePr>
+              <a:graphicFrameLocks xmlns:a="http://schemas.openxmlformats.org/drawingml/2006/main" noChangeAspect="1"/>
+            </wp:cNvGraphicFramePr>
+            <a:graphic xmlns:a="http://schemas.openxmlformats.org/drawingml/2006/main">
+              <a:graphicData uri="http://schemas.openxmlformats.org/drawingml/2006/picture">
+                <pic:pic xmlns:pic="http://schemas.openxmlformats.org/drawingml/2006/picture">
+                  <pic:nvPicPr>
+                    <pic:cNvPr id="1" name=""/>
+                    <pic:cNvPicPr/>
+                  </pic:nvPicPr>
+                  <pic:blipFill rotWithShape="1">
+                    <a:blip r:embed="rId12"/>
+                    <a:srcRect l="1867" t="31094" r="51120" b="34795"/>
+                    <a:stretch/>
+                  </pic:blipFill>
+                  <pic:spPr bwMode="auto">
+                    <a:xfrm>
+                      <a:off x="0" y="0"/>
+                      <a:ext cx="4356801" cy="1777323"/>
+                    </a:xfrm>
+                    <a:prstGeom prst="rect">
+                      <a:avLst/>
+                    </a:prstGeom>
+                    <a:ln>
+                      <a:noFill/>
+                    </a:ln>
+                    <a:extLst>
+                      <a:ext uri="{53640926-AAD7-44D8-BBD7-CCE9431645EC}">
+                        <a14:shadowObscured xmlns:a14="http://schemas.microsoft.com/office/drawing/2010/main"/>
+                      </a:ext>
+                    </a:extLst>
+                  </pic:spPr>
+                </pic:pic>
+              </a:graphicData>
+            </a:graphic>
+          </wp:inline>
+        </w:drawing>
+      </w:r>
+    </w:p>
+    <w:p>
+      <w:pPr>
+        <w:rPr>
+          <w:rFonts w:ascii="Arial" w:hAnsi="Arial" w:cs="Arial"/>
+          <w:b/>
+          <w:bCs/>
+          <w:lang w:val="es-AR"/>
+        </w:rPr>
+      </w:pPr>
+    </w:p>
+    <w:p>
+      <w:pPr>
+        <w:rPr>
+          <w:rFonts w:ascii="Arial" w:hAnsi="Arial" w:cs="Arial"/>
+          <w:b/>
+          <w:bCs/>
+          <w:lang w:val="es-AR"/>
+        </w:rPr>
+      </w:pPr>
+      <w:r>
+        <w:rPr>
+          <w:rFonts w:ascii="Arial" w:hAnsi="Arial" w:cs="Arial"/>
+          <w:b/>
+          <w:bCs/>
+          <w:lang w:val="es-AR"/>
+        </w:rPr>
+        <w:t>Listado de Herramientas y tecnologías</w:t>
+      </w:r>
+    </w:p>
+    <w:p>
+      <w:pPr>
+        <w:pStyle w:val="Prrafodelista"/>
+        <w:numPr>
+          <w:ilvl w:val="0"/>
+          <w:numId w:val="6"/>
+        </w:numPr>
+        <w:spacing w:line="360" w:lineRule="auto"/>
+        <w:ind w:left="714" w:hanging="357"/>
+        <w:jc w:val="both"/>
+        <w:rPr>
+          <w:rFonts w:ascii="Arial" w:hAnsi="Arial" w:cs="Arial"/>
+          <w:lang w:val="es-AR"/>
+        </w:rPr>
+      </w:pPr>
+      <w:r>
+        <w:rPr>
+          <w:rFonts w:ascii="Arial" w:hAnsi="Arial" w:cs="Arial"/>
+          <w:b/>
+          <w:bCs/>
+          <w:lang w:val="es-AR"/>
+        </w:rPr>
+        <w:t>MySQL Workbench:</w:t>
+      </w:r>
+      <w:r>
+        <w:rPr>
+          <w:rFonts w:ascii="Arial" w:hAnsi="Arial" w:cs="Arial"/>
+          <w:lang w:val="es-AR"/>
+        </w:rPr>
+        <w:t xml:space="preserve"> utilicé esta interfaz pa</w:t>
+      </w:r>
+      <w:r>
+        <w:rPr>
+          <w:rFonts w:ascii="Arial" w:hAnsi="Arial" w:cs="Arial"/>
+          <w:lang w:val="es-AR"/>
+        </w:rPr>
+        <w:t>ra diseñar y crear la base de datos relacional, gestionar tablas y realizar consultas SQL.</w:t>
+      </w:r>
+    </w:p>
+    <w:p>
+      <w:pPr>
+        <w:pStyle w:val="Prrafodelista"/>
+        <w:numPr>
+          <w:ilvl w:val="0"/>
+          <w:numId w:val="6"/>
+        </w:numPr>
+        <w:spacing w:line="360" w:lineRule="auto"/>
+        <w:ind w:left="714" w:hanging="357"/>
+        <w:jc w:val="both"/>
+        <w:rPr>
+          <w:rFonts w:ascii="Arial" w:hAnsi="Arial" w:cs="Arial"/>
+          <w:lang w:val="es-AR"/>
+        </w:rPr>
+      </w:pPr>
+      <w:r>
+        <w:rPr>
+          <w:rFonts w:ascii="Arial" w:hAnsi="Arial" w:cs="Arial"/>
+          <w:b/>
+          <w:bCs/>
+          <w:lang w:val="es-AR"/>
+        </w:rPr>
+        <w:t>Draw.io:</w:t>
+      </w:r>
+      <w:r>
+        <w:rPr>
+          <w:rFonts w:ascii="Arial" w:hAnsi="Arial" w:cs="Arial"/>
+          <w:lang w:val="es-AR"/>
+        </w:rPr>
+        <w:t xml:space="preserve"> usé esta herramienta para diseñar el diagrama entidad-relación (DER) y visualizar la estructura y relaciones de la base de datos. Este lo comparé con el Reverse </w:t>
+      </w:r>
+      <w:proofErr w:type="spellStart"/>
+      <w:r>
+        <w:rPr>
+          <w:rFonts w:ascii="Arial" w:hAnsi="Arial" w:cs="Arial"/>
+          <w:lang w:val="es-AR"/>
+        </w:rPr>
+        <w:t>Engineer</w:t>
+      </w:r>
+      <w:proofErr w:type="spellEnd"/>
+      <w:r>
+        <w:rPr>
+          <w:rFonts w:ascii="Arial" w:hAnsi="Arial" w:cs="Arial"/>
+          <w:lang w:val="es-AR"/>
+        </w:rPr>
+        <w:t xml:space="preserve"> del </w:t>
+      </w:r>
+      <w:proofErr w:type="spellStart"/>
+      <w:r>
+        <w:rPr>
+          <w:rFonts w:ascii="Arial" w:hAnsi="Arial" w:cs="Arial"/>
+          <w:lang w:val="es-AR"/>
+        </w:rPr>
+        <w:t>workbench</w:t>
+      </w:r>
+      <w:proofErr w:type="spellEnd"/>
+      <w:r>
+        <w:rPr>
+          <w:rFonts w:ascii="Arial" w:hAnsi="Arial" w:cs="Arial"/>
+          <w:lang w:val="es-AR"/>
+        </w:rPr>
+        <w:t xml:space="preserve"> del MySQL. </w:t>
+      </w:r>
+    </w:p>
+    <w:p>
+      <w:pPr>
+        <w:pStyle w:val="Prrafodelista"/>
+        <w:numPr>
+          <w:ilvl w:val="0"/>
+          <w:numId w:val="6"/>
+        </w:numPr>
+        <w:spacing w:line="360" w:lineRule="auto"/>
+        <w:ind w:left="714" w:hanging="357"/>
+        <w:jc w:val="both"/>
+        <w:rPr>
+          <w:rFonts w:ascii="Arial" w:hAnsi="Arial" w:cs="Arial"/>
+          <w:lang w:val="es-AR"/>
+        </w:rPr>
+      </w:pPr>
+      <w:r>
+        <w:rPr>
+          <w:rFonts w:ascii="Arial" w:hAnsi="Arial" w:cs="Arial"/>
+          <w:b/>
+          <w:bCs/>
+          <w:lang w:val="es-AR"/>
+        </w:rPr>
+        <w:t>Excel:</w:t>
+      </w:r>
+      <w:r>
+        <w:rPr>
+          <w:rFonts w:ascii="Arial" w:hAnsi="Arial" w:cs="Arial"/>
+          <w:lang w:val="es-AR"/>
+        </w:rPr>
+        <w:t xml:space="preserve"> para cargar datos, hacer tablas y gráficos de visualización</w:t>
+      </w:r>
+    </w:p>
+    <w:p>
+      <w:pPr>
+        <w:pStyle w:val="Prrafodelista"/>
+        <w:numPr>
+          <w:ilvl w:val="0"/>
+          <w:numId w:val="6"/>
+        </w:numPr>
+        <w:spacing w:line="360" w:lineRule="auto"/>
+        <w:ind w:left="714" w:hanging="357"/>
+        <w:jc w:val="both"/>
+        <w:rPr>
+          <w:rFonts w:ascii="Arial" w:hAnsi="Arial" w:cs="Arial"/>
+          <w:lang w:val="es-AR"/>
+        </w:rPr>
+      </w:pPr>
+      <w:r>
+        <w:rPr>
+          <w:rFonts w:ascii="Arial" w:hAnsi="Arial" w:cs="Arial"/>
+          <w:b/>
+          <w:bCs/>
+          <w:lang w:val="es-AR"/>
+        </w:rPr>
+        <w:t>GitHub</w:t>
+      </w:r>
+      <w:r>
+        <w:rPr>
+          <w:rFonts w:ascii="Arial" w:hAnsi="Arial" w:cs="Arial"/>
+          <w:lang w:val="es-AR"/>
+        </w:rPr>
+        <w:t>: para el control de versiones para gestionar el código, mantener un respaldo de las actualizaciones que voy realizando, y facilitar la manera de acceso de los archivos.</w:t>
+      </w:r>
+    </w:p>
+    <w:p>
+      <w:pPr>
+        <w:rPr>
+          <w:rFonts w:ascii="Arial" w:hAnsi="Arial" w:cs="Arial"/>
+          <w:lang w:val="es-AR"/>
+        </w:rPr>
+      </w:pPr>
+    </w:p>
+    <w:p>
+      <w:pPr>
+        <w:rPr>
+          <w:rFonts w:ascii="Arial" w:hAnsi="Arial" w:cs="Arial"/>
+          <w:lang w:val="es-AR"/>
+        </w:rPr>
+      </w:pPr>
+    </w:p>
+    <w:p>
+      <w:pPr>
+        <w:rPr>
+          <w:rFonts w:ascii="Arial" w:hAnsi="Arial" w:cs="Arial"/>
+          <w:lang w:val="es-AR"/>
+        </w:rPr>
+      </w:pPr>
+    </w:p>
+    <w:p>
+      <w:pPr>
+        <w:rPr>
+          <w:rFonts w:ascii="Arial" w:hAnsi="Arial" w:cs="Arial"/>
+          <w:lang w:val="es-AR"/>
+        </w:rPr>
+      </w:pPr>
+    </w:p>
+    <w:p>
+      <w:pPr>
+        <w:rPr>
+          <w:rFonts w:ascii="Arial" w:hAnsi="Arial" w:cs="Arial"/>
+          <w:lang w:val="es-AR"/>
+        </w:rPr>
+      </w:pPr>
+    </w:p>
+    <w:p>
+      <w:pPr>
+        <w:rPr>
+          <w:rFonts w:ascii="Arial" w:hAnsi="Arial" w:cs="Arial"/>
+          <w:lang w:val="es-AR"/>
+        </w:rPr>
+      </w:pPr>
+    </w:p>
+    <w:p>
+      <w:pPr>
+        <w:rPr>
+          <w:rFonts w:ascii="Arial" w:hAnsi="Arial" w:cs="Arial"/>
+          <w:lang w:val="es-AR"/>
+        </w:rPr>
+      </w:pPr>
+    </w:p>
+    <w:p>
+      <w:pPr>
+        <w:rPr>
+          <w:rFonts w:ascii="Arial" w:hAnsi="Arial" w:cs="Arial"/>
+          <w:lang w:val="es-AR"/>
+        </w:rPr>
+      </w:pPr>
+    </w:p>
+    <w:p>
+      <w:pPr>
+        <w:rPr>
+          <w:rFonts w:ascii="Arial" w:hAnsi="Arial" w:cs="Arial"/>
+          <w:lang w:val="es-AR"/>
+        </w:rPr>
+      </w:pPr>
+    </w:p>
+    <w:p>
+      <w:pPr>
+        <w:rPr>
+          <w:rFonts w:ascii="Arial" w:hAnsi="Arial" w:cs="Arial"/>
+          <w:lang w:val="es-AR"/>
+        </w:rPr>
+      </w:pPr>
+    </w:p>
+    <w:p>
+      <w:pPr>
+        <w:rPr>
+          <w:rFonts w:ascii="Arial" w:hAnsi="Arial" w:cs="Arial"/>
+          <w:lang w:val="es-AR"/>
         </w:rPr>
       </w:pPr>
     </w:p>
@@ -11552,6 +13960,118 @@
     </w:lvl>
   </w:abstractNum>
   <w:abstractNum w:abstractNumId="4" w15:restartNumberingAfterBreak="0">
+    <w:nsid w:val="744E33B8"/>
+    <w:multiLevelType w:val="hybridMultilevel"/>
+    <w:tmpl w:val="01D81E7C"/>
+    <w:lvl w:ilvl="0" w:tplc="8ADEC8B2">
+      <w:numFmt w:val="bullet"/>
+      <w:lvlText w:val="-"/>
+      <w:lvlJc w:val="left"/>
+      <w:pPr>
+        <w:ind w:left="720" w:hanging="360"/>
+      </w:pPr>
+      <w:rPr>
+        <w:rFonts w:ascii="Arial" w:eastAsiaTheme="minorEastAsia" w:hAnsi="Arial" w:cs="Arial" w:hint="default"/>
+      </w:rPr>
+    </w:lvl>
+    <w:lvl w:ilvl="1" w:tplc="2C0A0003" w:tentative="1">
+      <w:start w:val="1"/>
+      <w:numFmt w:val="bullet"/>
+      <w:lvlText w:val="o"/>
+      <w:lvlJc w:val="left"/>
+      <w:pPr>
+        <w:ind w:left="1440" w:hanging="360"/>
+      </w:pPr>
+      <w:rPr>
+        <w:rFonts w:ascii="Courier New" w:hAnsi="Courier New" w:cs="Courier New" w:hint="default"/>
+      </w:rPr>
+    </w:lvl>
+    <w:lvl w:ilvl="2" w:tplc="2C0A0005" w:tentative="1">
+      <w:start w:val="1"/>
+      <w:numFmt w:val="bullet"/>
+      <w:lvlText w:val=""/>
+      <w:lvlJc w:val="left"/>
+      <w:pPr>
+        <w:ind w:left="2160" w:hanging="360"/>
+      </w:pPr>
+      <w:rPr>
+        <w:rFonts w:ascii="Wingdings" w:hAnsi="Wingdings" w:hint="default"/>
+      </w:rPr>
+    </w:lvl>
+    <w:lvl w:ilvl="3" w:tplc="2C0A0001" w:tentative="1">
+      <w:start w:val="1"/>
+      <w:numFmt w:val="bullet"/>
+      <w:lvlText w:val=""/>
+      <w:lvlJc w:val="left"/>
+      <w:pPr>
+        <w:ind w:left="2880" w:hanging="360"/>
+      </w:pPr>
+      <w:rPr>
+        <w:rFonts w:ascii="Symbol" w:hAnsi="Symbol" w:hint="default"/>
+      </w:rPr>
+    </w:lvl>
+    <w:lvl w:ilvl="4" w:tplc="2C0A0003" w:tentative="1">
+      <w:start w:val="1"/>
+      <w:numFmt w:val="bullet"/>
+      <w:lvlText w:val="o"/>
+      <w:lvlJc w:val="left"/>
+      <w:pPr>
+        <w:ind w:left="3600" w:hanging="360"/>
+      </w:pPr>
+      <w:rPr>
+        <w:rFonts w:ascii="Courier New" w:hAnsi="Courier New" w:cs="Courier New" w:hint="default"/>
+      </w:rPr>
+    </w:lvl>
+    <w:lvl w:ilvl="5" w:tplc="2C0A0005" w:tentative="1">
+      <w:start w:val="1"/>
+      <w:numFmt w:val="bullet"/>
+      <w:lvlText w:val=""/>
+      <w:lvlJc w:val="left"/>
+      <w:pPr>
+        <w:ind w:left="4320" w:hanging="360"/>
+      </w:pPr>
+      <w:rPr>
+        <w:rFonts w:ascii="Wingdings" w:hAnsi="Wingdings" w:hint="default"/>
+      </w:rPr>
+    </w:lvl>
+    <w:lvl w:ilvl="6" w:tplc="2C0A0001" w:tentative="1">
+      <w:start w:val="1"/>
+      <w:numFmt w:val="bullet"/>
+      <w:lvlText w:val=""/>
+      <w:lvlJc w:val="left"/>
+      <w:pPr>
+        <w:ind w:left="5040" w:hanging="360"/>
+      </w:pPr>
+      <w:rPr>
+        <w:rFonts w:ascii="Symbol" w:hAnsi="Symbol" w:hint="default"/>
+      </w:rPr>
+    </w:lvl>
+    <w:lvl w:ilvl="7" w:tplc="2C0A0003" w:tentative="1">
+      <w:start w:val="1"/>
+      <w:numFmt w:val="bullet"/>
+      <w:lvlText w:val="o"/>
+      <w:lvlJc w:val="left"/>
+      <w:pPr>
+        <w:ind w:left="5760" w:hanging="360"/>
+      </w:pPr>
+      <w:rPr>
+        <w:rFonts w:ascii="Courier New" w:hAnsi="Courier New" w:cs="Courier New" w:hint="default"/>
+      </w:rPr>
+    </w:lvl>
+    <w:lvl w:ilvl="8" w:tplc="2C0A0005" w:tentative="1">
+      <w:start w:val="1"/>
+      <w:numFmt w:val="bullet"/>
+      <w:lvlText w:val=""/>
+      <w:lvlJc w:val="left"/>
+      <w:pPr>
+        <w:ind w:left="6480" w:hanging="360"/>
+      </w:pPr>
+      <w:rPr>
+        <w:rFonts w:ascii="Wingdings" w:hAnsi="Wingdings" w:hint="default"/>
+      </w:rPr>
+    </w:lvl>
+  </w:abstractNum>
+  <w:abstractNum w:abstractNumId="5" w15:restartNumberingAfterBreak="0">
     <w:nsid w:val="77EB3CF0"/>
     <w:multiLevelType w:val="hybridMultilevel"/>
     <w:tmpl w:val="8BB62914"/>
@@ -11641,7 +14161,7 @@
     </w:lvl>
   </w:abstractNum>
   <w:num w:numId="1" w16cid:durableId="928780673">
-    <w:abstractNumId w:val="4"/>
+    <w:abstractNumId w:val="5"/>
   </w:num>
   <w:num w:numId="2" w16cid:durableId="1295335615">
     <w:abstractNumId w:val="3"/>
@@ -11654,6 +14174,9 @@
   </w:num>
   <w:num w:numId="5" w16cid:durableId="1335650661">
     <w:abstractNumId w:val="0"/>
+  </w:num>
+  <w:num w:numId="6" w16cid:durableId="974986419">
+    <w:abstractNumId w:val="4"/>
   </w:num>
 </w:numbering>
 </file>
@@ -12268,7 +14791,6 @@
   <w:style w:type="character" w:default="1" w:styleId="Fuentedeprrafopredeter">
     <w:name w:val="Default Paragraph Font"/>
     <w:uiPriority w:val="1"/>
-    <w:semiHidden/>
     <w:unhideWhenUsed/>
   </w:style>
   <w:style w:type="table" w:default="1" w:styleId="Tablanormal">

</xml_diff>